<commit_message>
refactor(cv): 👷 update resume
</commit_message>
<xml_diff>
--- a/public/downloads/resume-daniel-krsiak.docx
+++ b/public/downloads/resume-daniel-krsiak.docx
@@ -8,16 +8,16 @@
         <w:rPr>
           <w:b w:val="1"/>
           <w:bCs w:val="1"/>
-          <w:sz w:val="20"/>
-          <w:szCs w:val="20"/>
-        </w:rPr>
-      </w:pPr>
-      <w:r>
-        <w:rPr>
-          <w:b w:val="1"/>
-          <w:bCs w:val="1"/>
-          <w:sz w:val="20"/>
-          <w:szCs w:val="20"/>
+          <w:sz w:val="24"/>
+          <w:szCs w:val="24"/>
+        </w:rPr>
+      </w:pPr>
+      <w:r>
+        <w:rPr>
+          <w:b w:val="1"/>
+          <w:bCs w:val="1"/>
+          <w:sz w:val="24"/>
+          <w:szCs w:val="24"/>
           <w:rtl w:val="0"/>
         </w:rPr>
         <w:t xml:space="preserve">DANIEL KRSIAK</w:t>
@@ -203,7 +203,6 @@
             <w:iCs w:val="0"/>
             <w:smallCaps w:val="0"/>
             <w:strike w:val="0"/>
-            <w:color w:val="1155cc"/>
             <w:sz w:val="20"/>
             <w:szCs w:val="20"/>
             <w:u w:val="single"/>
@@ -275,7 +274,6 @@
             <w:iCs w:val="0"/>
             <w:smallCaps w:val="0"/>
             <w:strike w:val="0"/>
-            <w:color w:val="1155cc"/>
             <w:sz w:val="20"/>
             <w:szCs w:val="20"/>
             <w:u w:val="single"/>
@@ -347,7 +345,6 @@
             <w:iCs w:val="0"/>
             <w:smallCaps w:val="0"/>
             <w:strike w:val="0"/>
-            <w:color w:val="1155cc"/>
             <w:sz w:val="20"/>
             <w:szCs w:val="20"/>
             <w:u w:val="single"/>
@@ -370,16 +367,16 @@
         <w:rPr>
           <w:b w:val="1"/>
           <w:bCs w:val="1"/>
-          <w:sz w:val="20"/>
-          <w:szCs w:val="20"/>
-        </w:rPr>
-      </w:pPr>
-      <w:r>
-        <w:rPr>
-          <w:b w:val="1"/>
-          <w:bCs w:val="1"/>
-          <w:sz w:val="20"/>
-          <w:szCs w:val="20"/>
+          <w:sz w:val="24"/>
+          <w:szCs w:val="24"/>
+        </w:rPr>
+      </w:pPr>
+      <w:r>
+        <w:rPr>
+          <w:b w:val="1"/>
+          <w:bCs w:val="1"/>
+          <w:sz w:val="24"/>
+          <w:szCs w:val="24"/>
           <w:rtl w:val="0"/>
         </w:rPr>
         <w:t xml:space="preserve">SUMMARY</w:t>
@@ -387,19 +384,19 @@
     </w:p>
     <w:p>
       <w:pPr>
-        <w:spacing w:after="0" w:lineRule="auto"/>
-        <w:rPr>
-          <w:sz w:val="20"/>
-          <w:szCs w:val="20"/>
-        </w:rPr>
-      </w:pPr>
-      <w:r>
-        <w:rPr>
-          <w:sz w:val="20"/>
-          <w:szCs w:val="20"/>
-          <w:rtl w:val="0"/>
-        </w:rPr>
-        <w:t xml:space="preserve">React Developer with 7+ years of experience building responsive and scalable web applications.</w:t>
+        <w:spacing w:after="0" w:before="200" w:lineRule="auto"/>
+        <w:rPr>
+          <w:sz w:val="20"/>
+          <w:szCs w:val="20"/>
+        </w:rPr>
+      </w:pPr>
+      <w:r>
+        <w:rPr>
+          <w:sz w:val="20"/>
+          <w:szCs w:val="20"/>
+          <w:rtl w:val="0"/>
+        </w:rPr>
+        <w:t xml:space="preserve">React Developer with 7+ years of experience, building responsive, AI-powered, and scalable web applications.</w:t>
       </w:r>
     </w:p>
     <w:p>
@@ -426,20 +423,20 @@
     </w:p>
     <w:p>
       <w:pPr>
-        <w:spacing w:after="0" w:before="240" w:lineRule="auto"/>
-        <w:rPr>
-          <w:b w:val="1"/>
-          <w:bCs w:val="1"/>
-          <w:sz w:val="20"/>
-          <w:szCs w:val="20"/>
-        </w:rPr>
-      </w:pPr>
-      <w:r>
-        <w:rPr>
-          <w:b w:val="1"/>
-          <w:bCs w:val="1"/>
-          <w:sz w:val="20"/>
-          <w:szCs w:val="20"/>
+        <w:spacing w:after="0" w:before="240" w:line="240" w:lineRule="auto"/>
+        <w:rPr>
+          <w:b w:val="1"/>
+          <w:bCs w:val="1"/>
+          <w:sz w:val="24"/>
+          <w:szCs w:val="24"/>
+        </w:rPr>
+      </w:pPr>
+      <w:r>
+        <w:rPr>
+          <w:b w:val="1"/>
+          <w:bCs w:val="1"/>
+          <w:sz w:val="24"/>
+          <w:szCs w:val="24"/>
           <w:rtl w:val="0"/>
         </w:rPr>
         <w:t xml:space="preserve">EXPERIENCE</w:t>
@@ -447,7 +444,7 @@
     </w:p>
     <w:p>
       <w:pPr>
-        <w:spacing w:after="0" w:before="240" w:lineRule="auto"/>
+        <w:spacing w:after="0" w:before="200" w:line="240" w:lineRule="auto"/>
         <w:rPr>
           <w:b w:val="1"/>
           <w:bCs w:val="1"/>
@@ -486,7 +483,7 @@
           <w:szCs w:val="20"/>
           <w:rtl w:val="0"/>
         </w:rPr>
-        <w:t xml:space="preserve">1 year, Jul 2025 – Feb 2026</w:t>
+        <w:t xml:space="preserve">1 year, Jul 2025 – Jun 2026</w:t>
       </w:r>
       <w:r>
         <w:rPr>
@@ -510,12 +507,63 @@
       </w:pPr>
       <w:r>
         <w:rPr>
+          <w:b w:val="1"/>
+          <w:bCs w:val="1"/>
           <w:sz w:val="20"/>
           <w:szCs w:val="20"/>
           <w:highlight w:val="white"/>
           <w:rtl w:val="0"/>
         </w:rPr>
-        <w:t xml:space="preserve">Developed AI-powered chat and AI Public Tenders Dashboards with document analysis.</w:t>
+        <w:t xml:space="preserve">Developed</w:t>
+      </w:r>
+      <w:r>
+        <w:rPr>
+          <w:sz w:val="20"/>
+          <w:szCs w:val="20"/>
+          <w:highlight w:val="white"/>
+          <w:rtl w:val="0"/>
+        </w:rPr>
+        <w:t xml:space="preserve"> </w:t>
+      </w:r>
+      <w:r>
+        <w:rPr>
+          <w:b w:val="1"/>
+          <w:bCs w:val="1"/>
+          <w:sz w:val="20"/>
+          <w:szCs w:val="20"/>
+          <w:highlight w:val="white"/>
+          <w:rtl w:val="0"/>
+        </w:rPr>
+        <w:t xml:space="preserve">AI-powered chat</w:t>
+      </w:r>
+      <w:r>
+        <w:rPr>
+          <w:sz w:val="20"/>
+          <w:szCs w:val="20"/>
+          <w:highlight w:val="white"/>
+          <w:rtl w:val="0"/>
+        </w:rPr>
+        <w:t xml:space="preserve"> and </w:t>
+      </w:r>
+      <w:r>
+        <w:rPr>
+          <w:b w:val="1"/>
+          <w:bCs w:val="1"/>
+          <w:sz w:val="20"/>
+          <w:szCs w:val="20"/>
+          <w:highlight w:val="white"/>
+          <w:rtl w:val="0"/>
+        </w:rPr>
+        <w:t xml:space="preserve">AI Public Tenders Dashboards</w:t>
+      </w:r>
+      <w:r>
+        <w:rPr>
+          <w:sz w:val="20"/>
+          <w:szCs w:val="20"/>
+          <w:highlight w:val="white"/>
+          <w:rtl w:val="0"/>
+        </w:rPr>
+        <w:t xml:space="preserve"> with document analysis.</w:t>
       </w:r>
       <w:r>
         <w:rPr>
@@ -542,7 +590,7 @@
           <w:szCs w:val="20"/>
           <w:rtl w:val="0"/>
         </w:rPr>
-        <w:t xml:space="preserve">React, TypeScript, Next.js, Material UI, React Hook Form, Zod, GraphQL, Zustand, Figma, Jira.</w:t>
+        <w:t xml:space="preserve">React, TypeScript, Next.js, MUI, React Hook Form, Zod, GraphQL, Zustand, Figma, Jira, Copilot, Claude.</w:t>
       </w:r>
       <w:r>
         <w:rPr>
@@ -808,11 +856,21 @@
       </w:pPr>
       <w:r>
         <w:rPr>
-          <w:sz w:val="20"/>
-          <w:szCs w:val="20"/>
-          <w:rtl w:val="0"/>
-        </w:rPr>
-        <w:t xml:space="preserve">Developed an internal insurance application for employees to manage insurance policies.</w:t>
+          <w:b w:val="1"/>
+          <w:bCs w:val="1"/>
+          <w:sz w:val="20"/>
+          <w:szCs w:val="20"/>
+          <w:rtl w:val="0"/>
+        </w:rPr>
+        <w:t xml:space="preserve">Developed an internal insurance application</w:t>
+      </w:r>
+      <w:r>
+        <w:rPr>
+          <w:sz w:val="20"/>
+          <w:szCs w:val="20"/>
+          <w:rtl w:val="0"/>
+        </w:rPr>
+        <w:t xml:space="preserve"> for employees to manage insurance policies.</w:t>
       </w:r>
       <w:r>
         <w:rPr>
@@ -1084,11 +1142,21 @@
       </w:pPr>
       <w:r>
         <w:rPr>
-          <w:sz w:val="20"/>
-          <w:szCs w:val="20"/>
-          <w:rtl w:val="0"/>
-        </w:rPr>
-        <w:t xml:space="preserve">Developed “Branches &amp; ATM locator” for the Czech 3rd-largest bank, serving 2M+ customers.</w:t>
+          <w:b w:val="1"/>
+          <w:bCs w:val="1"/>
+          <w:sz w:val="20"/>
+          <w:szCs w:val="20"/>
+          <w:rtl w:val="0"/>
+        </w:rPr>
+        <w:t xml:space="preserve">Developed “Branches &amp; ATM locator”</w:t>
+      </w:r>
+      <w:r>
+        <w:rPr>
+          <w:sz w:val="20"/>
+          <w:szCs w:val="20"/>
+          <w:rtl w:val="0"/>
+        </w:rPr>
+        <w:t xml:space="preserve"> for the Czech 3rd-largest bank, serving 2M+ customers.</w:t>
       </w:r>
       <w:r>
         <w:rPr>
@@ -1222,11 +1290,21 @@
       </w:pPr>
       <w:r>
         <w:rPr>
-          <w:sz w:val="20"/>
-          <w:szCs w:val="20"/>
-          <w:rtl w:val="0"/>
-        </w:rPr>
-        <w:t xml:space="preserve">Developed a customer care dashboard with chat support, used by 100,000 businesses worldwide</w:t>
+          <w:b w:val="1"/>
+          <w:bCs w:val="1"/>
+          <w:sz w:val="20"/>
+          <w:szCs w:val="20"/>
+          <w:rtl w:val="0"/>
+        </w:rPr>
+        <w:t xml:space="preserve">Developed a customer care dashboard</w:t>
+      </w:r>
+      <w:r>
+        <w:rPr>
+          <w:sz w:val="20"/>
+          <w:szCs w:val="20"/>
+          <w:rtl w:val="0"/>
+        </w:rPr>
+        <w:t xml:space="preserve"> with chat support, used by 100,000 businesses worldwide</w:t>
       </w:r>
       <w:r>
         <w:rPr>
@@ -1379,6 +1457,8 @@
       </w:pPr>
       <w:r>
         <w:rPr>
+          <w:b w:val="1"/>
+          <w:bCs w:val="1"/>
           <w:i w:val="0"/>
           <w:iCs w:val="0"/>
           <w:smallCaps w:val="0"/>
@@ -1390,7 +1470,22 @@
           <w:vertAlign w:val="baseline"/>
           <w:rtl w:val="0"/>
         </w:rPr>
-        <w:t xml:space="preserve">Developed company website with PHP, JavaScript, and SASS, using responsive design.</w:t>
+        <w:t xml:space="preserve">Developed company website</w:t>
+      </w:r>
+      <w:r>
+        <w:rPr>
+          <w:i w:val="0"/>
+          <w:iCs w:val="0"/>
+          <w:smallCaps w:val="0"/>
+          <w:strike w:val="0"/>
+          <w:sz w:val="20"/>
+          <w:szCs w:val="20"/>
+          <w:u w:val="none"/>
+          <w:shd w:fill="auto" w:val="clear"/>
+          <w:vertAlign w:val="baseline"/>
+          <w:rtl w:val="0"/>
+        </w:rPr>
+        <w:t xml:space="preserve"> with PHP, JavaScript, and SASS, using responsive design.</w:t>
       </w:r>
       <w:r>
         <w:rPr>
@@ -2273,48 +2368,22 @@
     </w:p>
     <w:p>
       <w:pPr>
-        <w:keepNext w:val="0"/>
-        <w:keepLines w:val="0"/>
-        <w:pageBreakBefore w:val="0"/>
-        <w:widowControl w:val="1"/>
         <w:numPr>
           <w:ilvl w:val="0"/>
           <w:numId w:val="1"/>
         </w:numPr>
-        <w:pBdr>
-          <w:top w:space="0" w:sz="0" w:val="nil"/>
-          <w:left w:space="0" w:sz="0" w:val="nil"/>
-          <w:bottom w:space="0" w:sz="0" w:val="nil"/>
-          <w:right w:space="0" w:sz="0" w:val="nil"/>
-          <w:between w:space="0" w:sz="0" w:val="nil"/>
-        </w:pBdr>
-        <w:shd w:fill="auto" w:val="clear"/>
-        <w:spacing w:after="0" w:before="0" w:line="276" w:lineRule="auto"/>
-        <w:ind w:left="720" w:right="0" w:hanging="360"/>
-        <w:jc w:val="left"/>
+        <w:spacing w:after="0" w:line="240" w:lineRule="auto"/>
+        <w:ind w:left="720" w:hanging="360"/>
         <w:rPr>
           <w:rFonts w:ascii="Calibri" w:cs="Calibri" w:eastAsia="Calibri" w:hAnsi="Calibri"/>
-          <w:i w:val="0"/>
-          <w:iCs w:val="0"/>
-          <w:smallCaps w:val="0"/>
-          <w:strike w:val="0"/>
-          <w:sz w:val="20"/>
-          <w:szCs w:val="20"/>
-          <w:shd w:fill="auto" w:val="clear"/>
-          <w:vertAlign w:val="baseline"/>
-        </w:rPr>
-      </w:pPr>
-      <w:r>
-        <w:rPr>
-          <w:i w:val="0"/>
-          <w:iCs w:val="0"/>
-          <w:smallCaps w:val="0"/>
-          <w:strike w:val="0"/>
-          <w:sz w:val="20"/>
-          <w:szCs w:val="20"/>
-          <w:u w:val="none"/>
-          <w:shd w:fill="auto" w:val="clear"/>
-          <w:vertAlign w:val="baseline"/>
+          <w:sz w:val="20"/>
+          <w:szCs w:val="20"/>
+        </w:rPr>
+      </w:pPr>
+      <w:r>
+        <w:rPr>
+          <w:sz w:val="20"/>
+          <w:szCs w:val="20"/>
           <w:rtl w:val="0"/>
         </w:rPr>
         <w:t xml:space="preserve">JavaScript</w:t>
@@ -2325,96 +2394,32 @@
           <w:szCs w:val="20"/>
           <w:rtl w:val="0"/>
         </w:rPr>
-        <w:t xml:space="preserve">:</w:t>
-      </w:r>
-      <w:r>
-        <w:rPr>
-          <w:i w:val="0"/>
-          <w:iCs w:val="0"/>
-          <w:smallCaps w:val="0"/>
-          <w:strike w:val="0"/>
-          <w:sz w:val="20"/>
-          <w:szCs w:val="20"/>
-          <w:u w:val="none"/>
-          <w:shd w:fill="auto" w:val="clear"/>
-          <w:vertAlign w:val="baseline"/>
-          <w:rtl w:val="0"/>
-        </w:rPr>
-        <w:t xml:space="preserve"> </w:t>
-      </w:r>
-      <w:r>
-        <w:rPr>
-          <w:sz w:val="20"/>
-          <w:szCs w:val="20"/>
-          <w:rtl w:val="0"/>
-        </w:rPr>
-        <w:t xml:space="preserve">8</w:t>
-      </w:r>
-      <w:r>
-        <w:rPr>
-          <w:i w:val="0"/>
-          <w:iCs w:val="0"/>
-          <w:smallCaps w:val="0"/>
-          <w:strike w:val="0"/>
-          <w:sz w:val="20"/>
-          <w:szCs w:val="20"/>
-          <w:u w:val="none"/>
-          <w:shd w:fill="auto" w:val="clear"/>
-          <w:vertAlign w:val="baseline"/>
-          <w:rtl w:val="0"/>
-        </w:rPr>
-        <w:t xml:space="preserve"> years</w:t>
-      </w:r>
-      <w:r>
-        <w:rPr>
-          <w:rtl w:val="0"/>
-        </w:rPr>
-      </w:r>
-    </w:p>
-    <w:p>
-      <w:pPr>
-        <w:keepNext w:val="0"/>
-        <w:keepLines w:val="0"/>
-        <w:pageBreakBefore w:val="0"/>
-        <w:widowControl w:val="1"/>
+        <w:t xml:space="preserve"> – 8 years </w:t>
+      </w:r>
+      <w:r>
+        <w:rPr>
+          <w:rtl w:val="0"/>
+        </w:rPr>
+      </w:r>
+    </w:p>
+    <w:p>
+      <w:pPr>
         <w:numPr>
           <w:ilvl w:val="0"/>
           <w:numId w:val="1"/>
         </w:numPr>
-        <w:pBdr>
-          <w:top w:space="0" w:sz="0" w:val="nil"/>
-          <w:left w:space="0" w:sz="0" w:val="nil"/>
-          <w:bottom w:space="0" w:sz="0" w:val="nil"/>
-          <w:right w:space="0" w:sz="0" w:val="nil"/>
-          <w:between w:space="0" w:sz="0" w:val="nil"/>
-        </w:pBdr>
-        <w:shd w:fill="auto" w:val="clear"/>
-        <w:spacing w:after="0" w:before="0" w:line="276" w:lineRule="auto"/>
-        <w:ind w:left="720" w:right="0" w:hanging="360"/>
-        <w:jc w:val="left"/>
+        <w:spacing w:after="0" w:line="240" w:lineRule="auto"/>
+        <w:ind w:left="720" w:hanging="360"/>
         <w:rPr>
           <w:rFonts w:ascii="Calibri" w:cs="Calibri" w:eastAsia="Calibri" w:hAnsi="Calibri"/>
-          <w:i w:val="0"/>
-          <w:iCs w:val="0"/>
-          <w:smallCaps w:val="0"/>
-          <w:strike w:val="0"/>
-          <w:sz w:val="20"/>
-          <w:szCs w:val="20"/>
-          <w:shd w:fill="auto" w:val="clear"/>
-          <w:vertAlign w:val="baseline"/>
-        </w:rPr>
-      </w:pPr>
-      <w:r>
-        <w:rPr>
-          <w:i w:val="0"/>
-          <w:iCs w:val="0"/>
-          <w:smallCaps w:val="0"/>
-          <w:strike w:val="0"/>
-          <w:sz w:val="20"/>
-          <w:szCs w:val="20"/>
-          <w:u w:val="none"/>
-          <w:shd w:fill="auto" w:val="clear"/>
-          <w:vertAlign w:val="baseline"/>
+          <w:sz w:val="20"/>
+          <w:szCs w:val="20"/>
+        </w:rPr>
+      </w:pPr>
+      <w:r>
+        <w:rPr>
+          <w:sz w:val="20"/>
+          <w:szCs w:val="20"/>
           <w:rtl w:val="0"/>
         </w:rPr>
         <w:t xml:space="preserve">TypeScript</w:t>
@@ -2425,104 +2430,32 @@
           <w:szCs w:val="20"/>
           <w:rtl w:val="0"/>
         </w:rPr>
-        <w:t xml:space="preserve">:</w:t>
-      </w:r>
-      <w:r>
-        <w:rPr>
-          <w:i w:val="0"/>
-          <w:iCs w:val="0"/>
-          <w:smallCaps w:val="0"/>
-          <w:strike w:val="0"/>
-          <w:sz w:val="20"/>
-          <w:szCs w:val="20"/>
-          <w:u w:val="none"/>
-          <w:shd w:fill="auto" w:val="clear"/>
-          <w:vertAlign w:val="baseline"/>
-          <w:rtl w:val="0"/>
-        </w:rPr>
-        <w:t xml:space="preserve"> </w:t>
-      </w:r>
-      <w:r>
-        <w:rPr>
-          <w:sz w:val="20"/>
-          <w:szCs w:val="20"/>
-          <w:rtl w:val="0"/>
-        </w:rPr>
-        <w:t xml:space="preserve">7</w:t>
-      </w:r>
-      <w:r>
-        <w:rPr>
-          <w:i w:val="0"/>
-          <w:iCs w:val="0"/>
-          <w:smallCaps w:val="0"/>
-          <w:strike w:val="0"/>
-          <w:sz w:val="20"/>
-          <w:szCs w:val="20"/>
-          <w:u w:val="none"/>
-          <w:shd w:fill="auto" w:val="clear"/>
-          <w:vertAlign w:val="baseline"/>
-          <w:rtl w:val="0"/>
-        </w:rPr>
-        <w:t xml:space="preserve"> year</w:t>
-      </w:r>
-      <w:r>
-        <w:rPr>
-          <w:sz w:val="20"/>
-          <w:szCs w:val="20"/>
-          <w:rtl w:val="0"/>
-        </w:rPr>
-        <w:t xml:space="preserve">s</w:t>
-      </w:r>
-      <w:r>
-        <w:rPr>
-          <w:rtl w:val="0"/>
-        </w:rPr>
-      </w:r>
-    </w:p>
-    <w:p>
-      <w:pPr>
-        <w:keepNext w:val="0"/>
-        <w:keepLines w:val="0"/>
-        <w:pageBreakBefore w:val="0"/>
-        <w:widowControl w:val="1"/>
+        <w:t xml:space="preserve"> – 7 years</w:t>
+      </w:r>
+      <w:r>
+        <w:rPr>
+          <w:rtl w:val="0"/>
+        </w:rPr>
+      </w:r>
+    </w:p>
+    <w:p>
+      <w:pPr>
         <w:numPr>
           <w:ilvl w:val="0"/>
           <w:numId w:val="1"/>
         </w:numPr>
-        <w:pBdr>
-          <w:top w:space="0" w:sz="0" w:val="nil"/>
-          <w:left w:space="0" w:sz="0" w:val="nil"/>
-          <w:bottom w:space="0" w:sz="0" w:val="nil"/>
-          <w:right w:space="0" w:sz="0" w:val="nil"/>
-          <w:between w:space="0" w:sz="0" w:val="nil"/>
-        </w:pBdr>
-        <w:shd w:fill="auto" w:val="clear"/>
-        <w:spacing w:after="0" w:before="0" w:line="276" w:lineRule="auto"/>
-        <w:ind w:left="720" w:right="0" w:hanging="360"/>
-        <w:jc w:val="left"/>
+        <w:spacing w:after="0" w:line="240" w:lineRule="auto"/>
+        <w:ind w:left="720" w:hanging="360"/>
         <w:rPr>
           <w:rFonts w:ascii="Calibri" w:cs="Calibri" w:eastAsia="Calibri" w:hAnsi="Calibri"/>
-          <w:i w:val="0"/>
-          <w:iCs w:val="0"/>
-          <w:smallCaps w:val="0"/>
-          <w:strike w:val="0"/>
-          <w:sz w:val="20"/>
-          <w:szCs w:val="20"/>
-          <w:shd w:fill="auto" w:val="clear"/>
-          <w:vertAlign w:val="baseline"/>
-        </w:rPr>
-      </w:pPr>
-      <w:r>
-        <w:rPr>
-          <w:i w:val="0"/>
-          <w:iCs w:val="0"/>
-          <w:smallCaps w:val="0"/>
-          <w:strike w:val="0"/>
-          <w:sz w:val="20"/>
-          <w:szCs w:val="20"/>
-          <w:u w:val="none"/>
-          <w:shd w:fill="auto" w:val="clear"/>
-          <w:vertAlign w:val="baseline"/>
+          <w:sz w:val="20"/>
+          <w:szCs w:val="20"/>
+        </w:rPr>
+      </w:pPr>
+      <w:r>
+        <w:rPr>
+          <w:sz w:val="20"/>
+          <w:szCs w:val="20"/>
           <w:rtl w:val="0"/>
         </w:rPr>
         <w:t xml:space="preserve">React</w:t>
@@ -2533,96 +2466,32 @@
           <w:szCs w:val="20"/>
           <w:rtl w:val="0"/>
         </w:rPr>
-        <w:t xml:space="preserve">:</w:t>
-      </w:r>
-      <w:r>
-        <w:rPr>
-          <w:i w:val="0"/>
-          <w:iCs w:val="0"/>
-          <w:smallCaps w:val="0"/>
-          <w:strike w:val="0"/>
-          <w:sz w:val="20"/>
-          <w:szCs w:val="20"/>
-          <w:u w:val="none"/>
-          <w:shd w:fill="auto" w:val="clear"/>
-          <w:vertAlign w:val="baseline"/>
-          <w:rtl w:val="0"/>
-        </w:rPr>
-        <w:t xml:space="preserve"> </w:t>
-      </w:r>
-      <w:r>
-        <w:rPr>
-          <w:sz w:val="20"/>
-          <w:szCs w:val="20"/>
-          <w:rtl w:val="0"/>
-        </w:rPr>
-        <w:t xml:space="preserve">7</w:t>
-      </w:r>
-      <w:r>
-        <w:rPr>
-          <w:i w:val="0"/>
-          <w:iCs w:val="0"/>
-          <w:smallCaps w:val="0"/>
-          <w:strike w:val="0"/>
-          <w:sz w:val="20"/>
-          <w:szCs w:val="20"/>
-          <w:u w:val="none"/>
-          <w:shd w:fill="auto" w:val="clear"/>
-          <w:vertAlign w:val="baseline"/>
-          <w:rtl w:val="0"/>
-        </w:rPr>
-        <w:t xml:space="preserve"> years</w:t>
-      </w:r>
-      <w:r>
-        <w:rPr>
-          <w:rtl w:val="0"/>
-        </w:rPr>
-      </w:r>
-    </w:p>
-    <w:p>
-      <w:pPr>
-        <w:keepNext w:val="0"/>
-        <w:keepLines w:val="0"/>
-        <w:pageBreakBefore w:val="0"/>
-        <w:widowControl w:val="1"/>
+        <w:t xml:space="preserve"> – 7 years</w:t>
+      </w:r>
+      <w:r>
+        <w:rPr>
+          <w:rtl w:val="0"/>
+        </w:rPr>
+      </w:r>
+    </w:p>
+    <w:p>
+      <w:pPr>
         <w:numPr>
           <w:ilvl w:val="0"/>
           <w:numId w:val="1"/>
         </w:numPr>
-        <w:pBdr>
-          <w:top w:space="0" w:sz="0" w:val="nil"/>
-          <w:left w:space="0" w:sz="0" w:val="nil"/>
-          <w:bottom w:space="0" w:sz="0" w:val="nil"/>
-          <w:right w:space="0" w:sz="0" w:val="nil"/>
-          <w:between w:space="0" w:sz="0" w:val="nil"/>
-        </w:pBdr>
-        <w:shd w:fill="auto" w:val="clear"/>
-        <w:spacing w:after="0" w:before="0" w:line="276" w:lineRule="auto"/>
-        <w:ind w:left="720" w:right="0" w:hanging="360"/>
-        <w:jc w:val="left"/>
+        <w:spacing w:after="0" w:line="240" w:lineRule="auto"/>
+        <w:ind w:left="720" w:hanging="360"/>
         <w:rPr>
           <w:rFonts w:ascii="Calibri" w:cs="Calibri" w:eastAsia="Calibri" w:hAnsi="Calibri"/>
-          <w:i w:val="0"/>
-          <w:iCs w:val="0"/>
-          <w:smallCaps w:val="0"/>
-          <w:strike w:val="0"/>
-          <w:sz w:val="20"/>
-          <w:szCs w:val="20"/>
-          <w:shd w:fill="auto" w:val="clear"/>
-          <w:vertAlign w:val="baseline"/>
-        </w:rPr>
-      </w:pPr>
-      <w:r>
-        <w:rPr>
-          <w:i w:val="0"/>
-          <w:iCs w:val="0"/>
-          <w:smallCaps w:val="0"/>
-          <w:strike w:val="0"/>
-          <w:sz w:val="20"/>
-          <w:szCs w:val="20"/>
-          <w:u w:val="none"/>
-          <w:shd w:fill="auto" w:val="clear"/>
-          <w:vertAlign w:val="baseline"/>
+          <w:sz w:val="20"/>
+          <w:szCs w:val="20"/>
+        </w:rPr>
+      </w:pPr>
+      <w:r>
+        <w:rPr>
+          <w:sz w:val="20"/>
+          <w:szCs w:val="20"/>
           <w:rtl w:val="0"/>
         </w:rPr>
         <w:t xml:space="preserve">Next.js</w:t>
@@ -2633,96 +2502,32 @@
           <w:szCs w:val="20"/>
           <w:rtl w:val="0"/>
         </w:rPr>
-        <w:t xml:space="preserve">:</w:t>
-      </w:r>
-      <w:r>
-        <w:rPr>
-          <w:i w:val="0"/>
-          <w:iCs w:val="0"/>
-          <w:smallCaps w:val="0"/>
-          <w:strike w:val="0"/>
-          <w:sz w:val="20"/>
-          <w:szCs w:val="20"/>
-          <w:u w:val="none"/>
-          <w:shd w:fill="auto" w:val="clear"/>
-          <w:vertAlign w:val="baseline"/>
-          <w:rtl w:val="0"/>
-        </w:rPr>
-        <w:t xml:space="preserve"> </w:t>
-      </w:r>
-      <w:r>
-        <w:rPr>
-          <w:sz w:val="20"/>
-          <w:szCs w:val="20"/>
-          <w:rtl w:val="0"/>
-        </w:rPr>
-        <w:t xml:space="preserve">3</w:t>
-      </w:r>
-      <w:r>
-        <w:rPr>
-          <w:i w:val="0"/>
-          <w:iCs w:val="0"/>
-          <w:smallCaps w:val="0"/>
-          <w:strike w:val="0"/>
-          <w:sz w:val="20"/>
-          <w:szCs w:val="20"/>
-          <w:u w:val="none"/>
-          <w:shd w:fill="auto" w:val="clear"/>
-          <w:vertAlign w:val="baseline"/>
-          <w:rtl w:val="0"/>
-        </w:rPr>
-        <w:t xml:space="preserve"> years</w:t>
-      </w:r>
-      <w:r>
-        <w:rPr>
-          <w:rtl w:val="0"/>
-        </w:rPr>
-      </w:r>
-    </w:p>
-    <w:p>
-      <w:pPr>
-        <w:keepNext w:val="0"/>
-        <w:keepLines w:val="0"/>
-        <w:pageBreakBefore w:val="0"/>
-        <w:widowControl w:val="1"/>
+        <w:t xml:space="preserve"> – 3 years</w:t>
+      </w:r>
+      <w:r>
+        <w:rPr>
+          <w:rtl w:val="0"/>
+        </w:rPr>
+      </w:r>
+    </w:p>
+    <w:p>
+      <w:pPr>
         <w:numPr>
           <w:ilvl w:val="0"/>
           <w:numId w:val="1"/>
         </w:numPr>
-        <w:pBdr>
-          <w:top w:space="0" w:sz="0" w:val="nil"/>
-          <w:left w:space="0" w:sz="0" w:val="nil"/>
-          <w:bottom w:space="0" w:sz="0" w:val="nil"/>
-          <w:right w:space="0" w:sz="0" w:val="nil"/>
-          <w:between w:space="0" w:sz="0" w:val="nil"/>
-        </w:pBdr>
-        <w:shd w:fill="auto" w:val="clear"/>
-        <w:spacing w:after="0" w:before="0" w:line="276" w:lineRule="auto"/>
-        <w:ind w:left="720" w:right="0" w:hanging="360"/>
-        <w:jc w:val="left"/>
+        <w:spacing w:after="0" w:line="240" w:lineRule="auto"/>
+        <w:ind w:left="720" w:hanging="360"/>
         <w:rPr>
           <w:rFonts w:ascii="Calibri" w:cs="Calibri" w:eastAsia="Calibri" w:hAnsi="Calibri"/>
-          <w:i w:val="0"/>
-          <w:iCs w:val="0"/>
-          <w:smallCaps w:val="0"/>
-          <w:strike w:val="0"/>
-          <w:sz w:val="20"/>
-          <w:szCs w:val="20"/>
-          <w:shd w:fill="auto" w:val="clear"/>
-          <w:vertAlign w:val="baseline"/>
-        </w:rPr>
-      </w:pPr>
-      <w:r>
-        <w:rPr>
-          <w:i w:val="0"/>
-          <w:iCs w:val="0"/>
-          <w:smallCaps w:val="0"/>
-          <w:strike w:val="0"/>
-          <w:sz w:val="20"/>
-          <w:szCs w:val="20"/>
-          <w:u w:val="none"/>
-          <w:shd w:fill="auto" w:val="clear"/>
-          <w:vertAlign w:val="baseline"/>
+          <w:sz w:val="20"/>
+          <w:szCs w:val="20"/>
+        </w:rPr>
+      </w:pPr>
+      <w:r>
+        <w:rPr>
+          <w:sz w:val="20"/>
+          <w:szCs w:val="20"/>
           <w:rtl w:val="0"/>
         </w:rPr>
         <w:t xml:space="preserve">Redux</w:t>
@@ -2733,292 +2538,449 @@
           <w:szCs w:val="20"/>
           <w:rtl w:val="0"/>
         </w:rPr>
-        <w:t xml:space="preserve">:</w:t>
-      </w:r>
-      <w:r>
-        <w:rPr>
-          <w:i w:val="0"/>
-          <w:iCs w:val="0"/>
-          <w:smallCaps w:val="0"/>
-          <w:strike w:val="0"/>
-          <w:sz w:val="20"/>
-          <w:szCs w:val="20"/>
-          <w:u w:val="none"/>
-          <w:shd w:fill="auto" w:val="clear"/>
-          <w:vertAlign w:val="baseline"/>
-          <w:rtl w:val="0"/>
-        </w:rPr>
-        <w:t xml:space="preserve"> 3 years</w:t>
-      </w:r>
-      <w:r>
-        <w:rPr>
-          <w:rtl w:val="0"/>
-        </w:rPr>
-      </w:r>
-    </w:p>
-    <w:p>
-      <w:pPr>
-        <w:keepNext w:val="0"/>
-        <w:keepLines w:val="0"/>
-        <w:pageBreakBefore w:val="0"/>
-        <w:widowControl w:val="1"/>
+        <w:t xml:space="preserve"> – 3 years</w:t>
+      </w:r>
+    </w:p>
+    <w:p>
+      <w:pPr>
         <w:numPr>
           <w:ilvl w:val="0"/>
           <w:numId w:val="1"/>
         </w:numPr>
-        <w:pBdr>
-          <w:top w:space="0" w:sz="0" w:val="nil"/>
-          <w:left w:space="0" w:sz="0" w:val="nil"/>
-          <w:bottom w:space="0" w:sz="0" w:val="nil"/>
-          <w:right w:space="0" w:sz="0" w:val="nil"/>
-          <w:between w:space="0" w:sz="0" w:val="nil"/>
-        </w:pBdr>
-        <w:shd w:fill="auto" w:val="clear"/>
-        <w:spacing w:after="0" w:before="0" w:line="276" w:lineRule="auto"/>
-        <w:ind w:left="720" w:right="0" w:hanging="360"/>
-        <w:jc w:val="left"/>
+        <w:spacing w:after="0" w:line="240" w:lineRule="auto"/>
+        <w:ind w:left="720" w:hanging="360"/>
         <w:rPr>
           <w:rFonts w:ascii="Calibri" w:cs="Calibri" w:eastAsia="Calibri" w:hAnsi="Calibri"/>
-          <w:i w:val="0"/>
-          <w:iCs w:val="0"/>
-          <w:smallCaps w:val="0"/>
-          <w:strike w:val="0"/>
-          <w:sz w:val="20"/>
-          <w:szCs w:val="20"/>
-          <w:shd w:fill="auto" w:val="clear"/>
-          <w:vertAlign w:val="baseline"/>
-        </w:rPr>
-      </w:pPr>
-      <w:r>
-        <w:rPr>
-          <w:i w:val="0"/>
-          <w:iCs w:val="0"/>
-          <w:smallCaps w:val="0"/>
-          <w:strike w:val="0"/>
-          <w:sz w:val="20"/>
-          <w:szCs w:val="20"/>
-          <w:u w:val="none"/>
-          <w:shd w:fill="auto" w:val="clear"/>
-          <w:vertAlign w:val="baseline"/>
-          <w:rtl w:val="0"/>
-        </w:rPr>
-        <w:t xml:space="preserve">Tailwind CSS, Styled Components, Emotion</w:t>
-      </w:r>
-      <w:r>
-        <w:rPr>
-          <w:rtl w:val="0"/>
-        </w:rPr>
-      </w:r>
-    </w:p>
-    <w:p>
-      <w:pPr>
-        <w:keepNext w:val="0"/>
-        <w:keepLines w:val="0"/>
-        <w:pageBreakBefore w:val="0"/>
-        <w:widowControl w:val="1"/>
+          <w:sz w:val="20"/>
+          <w:szCs w:val="20"/>
+        </w:rPr>
+      </w:pPr>
+      <w:r>
+        <w:rPr>
+          <w:sz w:val="20"/>
+          <w:szCs w:val="20"/>
+          <w:rtl w:val="0"/>
+        </w:rPr>
+        <w:t xml:space="preserve">Testing</w:t>
+      </w:r>
+      <w:r>
+        <w:rPr>
+          <w:sz w:val="20"/>
+          <w:szCs w:val="20"/>
+          <w:rtl w:val="0"/>
+        </w:rPr>
+        <w:t xml:space="preserve"> – 5 years</w:t>
+      </w:r>
+    </w:p>
+    <w:p>
+      <w:pPr>
         <w:numPr>
           <w:ilvl w:val="0"/>
           <w:numId w:val="1"/>
         </w:numPr>
-        <w:pBdr>
-          <w:top w:space="0" w:sz="0" w:val="nil"/>
-          <w:left w:space="0" w:sz="0" w:val="nil"/>
-          <w:bottom w:space="0" w:sz="0" w:val="nil"/>
-          <w:right w:space="0" w:sz="0" w:val="nil"/>
-          <w:between w:space="0" w:sz="0" w:val="nil"/>
-        </w:pBdr>
-        <w:shd w:fill="auto" w:val="clear"/>
-        <w:spacing w:after="0" w:before="0" w:line="276" w:lineRule="auto"/>
-        <w:ind w:left="720" w:right="0" w:hanging="360"/>
-        <w:jc w:val="left"/>
+        <w:spacing w:after="0" w:line="240" w:lineRule="auto"/>
+        <w:ind w:left="720" w:hanging="360"/>
         <w:rPr>
           <w:rFonts w:ascii="Calibri" w:cs="Calibri" w:eastAsia="Calibri" w:hAnsi="Calibri"/>
-          <w:i w:val="0"/>
-          <w:iCs w:val="0"/>
-          <w:smallCaps w:val="0"/>
-          <w:strike w:val="0"/>
-          <w:sz w:val="20"/>
-          <w:szCs w:val="20"/>
-          <w:shd w:fill="auto" w:val="clear"/>
-          <w:vertAlign w:val="baseline"/>
-        </w:rPr>
-      </w:pPr>
-      <w:r>
-        <w:rPr>
-          <w:i w:val="0"/>
-          <w:iCs w:val="0"/>
-          <w:smallCaps w:val="0"/>
-          <w:strike w:val="0"/>
-          <w:sz w:val="20"/>
-          <w:szCs w:val="20"/>
-          <w:u w:val="none"/>
-          <w:shd w:fill="auto" w:val="clear"/>
-          <w:vertAlign w:val="baseline"/>
-          <w:rtl w:val="0"/>
-        </w:rPr>
-        <w:t xml:space="preserve">Bootstrap, Chakra UI, Material UI, shadcnui</w:t>
-      </w:r>
-      <w:r>
-        <w:rPr>
-          <w:rtl w:val="0"/>
-        </w:rPr>
-      </w:r>
-    </w:p>
-    <w:p>
-      <w:pPr>
-        <w:keepNext w:val="0"/>
-        <w:keepLines w:val="0"/>
-        <w:pageBreakBefore w:val="0"/>
-        <w:widowControl w:val="1"/>
+          <w:sz w:val="20"/>
+          <w:szCs w:val="20"/>
+        </w:rPr>
+      </w:pPr>
+      <w:r>
+        <w:rPr>
+          <w:sz w:val="20"/>
+          <w:szCs w:val="20"/>
+          <w:rtl w:val="0"/>
+        </w:rPr>
+        <w:t xml:space="preserve">Team Leader</w:t>
+      </w:r>
+      <w:r>
+        <w:rPr>
+          <w:sz w:val="20"/>
+          <w:szCs w:val="20"/>
+          <w:rtl w:val="0"/>
+        </w:rPr>
+        <w:t xml:space="preserve"> – 2 years</w:t>
+      </w:r>
+    </w:p>
+    <w:p>
+      <w:pPr>
         <w:numPr>
           <w:ilvl w:val="0"/>
           <w:numId w:val="1"/>
         </w:numPr>
-        <w:pBdr>
-          <w:top w:space="0" w:sz="0" w:val="nil"/>
-          <w:left w:space="0" w:sz="0" w:val="nil"/>
-          <w:bottom w:space="0" w:sz="0" w:val="nil"/>
-          <w:right w:space="0" w:sz="0" w:val="nil"/>
-          <w:between w:space="0" w:sz="0" w:val="nil"/>
-        </w:pBdr>
-        <w:shd w:fill="auto" w:val="clear"/>
-        <w:spacing w:after="0" w:before="0" w:line="276" w:lineRule="auto"/>
-        <w:ind w:left="720" w:right="0" w:hanging="360"/>
-        <w:jc w:val="left"/>
+        <w:spacing w:after="0" w:line="240" w:lineRule="auto"/>
+        <w:ind w:left="720" w:hanging="360"/>
         <w:rPr>
           <w:rFonts w:ascii="Calibri" w:cs="Calibri" w:eastAsia="Calibri" w:hAnsi="Calibri"/>
-          <w:i w:val="0"/>
-          <w:iCs w:val="0"/>
-          <w:smallCaps w:val="0"/>
-          <w:strike w:val="0"/>
-          <w:sz w:val="20"/>
-          <w:szCs w:val="20"/>
-          <w:shd w:fill="auto" w:val="clear"/>
-          <w:vertAlign w:val="baseline"/>
-        </w:rPr>
-      </w:pPr>
-      <w:r>
-        <w:rPr>
-          <w:i w:val="0"/>
-          <w:iCs w:val="0"/>
-          <w:smallCaps w:val="0"/>
-          <w:strike w:val="0"/>
-          <w:sz w:val="20"/>
-          <w:szCs w:val="20"/>
-          <w:u w:val="none"/>
-          <w:shd w:fill="auto" w:val="clear"/>
-          <w:vertAlign w:val="baseline"/>
-          <w:rtl w:val="0"/>
-        </w:rPr>
-        <w:t xml:space="preserve">Adobe XD, Figma, Storybook</w:t>
-      </w:r>
-      <w:r>
-        <w:rPr>
-          <w:rtl w:val="0"/>
-        </w:rPr>
-      </w:r>
-    </w:p>
-    <w:p>
-      <w:pPr>
-        <w:keepNext w:val="0"/>
-        <w:keepLines w:val="0"/>
-        <w:pageBreakBefore w:val="0"/>
-        <w:widowControl w:val="1"/>
+          <w:b w:val="1"/>
+          <w:bCs w:val="1"/>
+          <w:sz w:val="20"/>
+          <w:szCs w:val="20"/>
+          <w:highlight w:val="white"/>
+        </w:rPr>
+      </w:pPr>
+      <w:r>
+        <w:rPr>
+          <w:sz w:val="20"/>
+          <w:szCs w:val="20"/>
+          <w:highlight w:val="white"/>
+          <w:rtl w:val="0"/>
+        </w:rPr>
+        <w:t xml:space="preserve">Tailwind CSS</w:t>
+      </w:r>
+      <w:r>
+        <w:rPr>
+          <w:sz w:val="20"/>
+          <w:szCs w:val="20"/>
+          <w:highlight w:val="white"/>
+          <w:rtl w:val="0"/>
+        </w:rPr>
+        <w:t xml:space="preserve">, </w:t>
+      </w:r>
+      <w:r>
+        <w:rPr>
+          <w:sz w:val="20"/>
+          <w:szCs w:val="20"/>
+          <w:highlight w:val="white"/>
+          <w:rtl w:val="0"/>
+        </w:rPr>
+        <w:t xml:space="preserve">Styled Components</w:t>
+      </w:r>
+    </w:p>
+    <w:p>
+      <w:pPr>
         <w:numPr>
           <w:ilvl w:val="0"/>
           <w:numId w:val="1"/>
         </w:numPr>
-        <w:pBdr>
-          <w:top w:space="0" w:sz="0" w:val="nil"/>
-          <w:left w:space="0" w:sz="0" w:val="nil"/>
-          <w:bottom w:space="0" w:sz="0" w:val="nil"/>
-          <w:right w:space="0" w:sz="0" w:val="nil"/>
-          <w:between w:space="0" w:sz="0" w:val="nil"/>
-        </w:pBdr>
-        <w:shd w:fill="auto" w:val="clear"/>
-        <w:spacing w:after="0" w:before="0" w:line="276" w:lineRule="auto"/>
-        <w:ind w:left="720" w:right="0" w:hanging="360"/>
-        <w:jc w:val="left"/>
+        <w:spacing w:after="0" w:line="240" w:lineRule="auto"/>
+        <w:ind w:left="720" w:hanging="360"/>
         <w:rPr>
           <w:rFonts w:ascii="Calibri" w:cs="Calibri" w:eastAsia="Calibri" w:hAnsi="Calibri"/>
-          <w:i w:val="0"/>
-          <w:iCs w:val="0"/>
-          <w:smallCaps w:val="0"/>
-          <w:strike w:val="0"/>
-          <w:sz w:val="20"/>
-          <w:szCs w:val="20"/>
-          <w:shd w:fill="auto" w:val="clear"/>
-          <w:vertAlign w:val="baseline"/>
-        </w:rPr>
-      </w:pPr>
-      <w:r>
-        <w:rPr>
-          <w:i w:val="0"/>
-          <w:iCs w:val="0"/>
-          <w:smallCaps w:val="0"/>
-          <w:strike w:val="0"/>
-          <w:sz w:val="20"/>
-          <w:szCs w:val="20"/>
-          <w:u w:val="none"/>
-          <w:shd w:fill="auto" w:val="clear"/>
-          <w:vertAlign w:val="baseline"/>
-          <w:rtl w:val="0"/>
-        </w:rPr>
-        <w:t xml:space="preserve">CI/CD, GitHub Actions, Vercel, Netlify</w:t>
-      </w:r>
-      <w:r>
-        <w:rPr>
-          <w:rtl w:val="0"/>
-        </w:rPr>
-      </w:r>
-    </w:p>
-    <w:p>
-      <w:pPr>
-        <w:keepNext w:val="0"/>
-        <w:keepLines w:val="0"/>
-        <w:pageBreakBefore w:val="0"/>
-        <w:widowControl w:val="1"/>
+          <w:sz w:val="20"/>
+          <w:szCs w:val="20"/>
+          <w:highlight w:val="white"/>
+        </w:rPr>
+      </w:pPr>
+      <w:r>
+        <w:rPr>
+          <w:sz w:val="20"/>
+          <w:szCs w:val="20"/>
+          <w:highlight w:val="white"/>
+          <w:rtl w:val="0"/>
+        </w:rPr>
+        <w:t xml:space="preserve">Bootstrap</w:t>
+      </w:r>
+      <w:r>
+        <w:rPr>
+          <w:sz w:val="20"/>
+          <w:szCs w:val="20"/>
+          <w:highlight w:val="white"/>
+          <w:rtl w:val="0"/>
+        </w:rPr>
+        <w:t xml:space="preserve">, </w:t>
+      </w:r>
+      <w:r>
+        <w:rPr>
+          <w:sz w:val="20"/>
+          <w:szCs w:val="20"/>
+          <w:highlight w:val="white"/>
+          <w:rtl w:val="0"/>
+        </w:rPr>
+        <w:t xml:space="preserve">Chakra UI</w:t>
+      </w:r>
+      <w:r>
+        <w:rPr>
+          <w:sz w:val="20"/>
+          <w:szCs w:val="20"/>
+          <w:highlight w:val="white"/>
+          <w:rtl w:val="0"/>
+        </w:rPr>
+        <w:t xml:space="preserve">,</w:t>
+      </w:r>
+      <w:r>
+        <w:rPr>
+          <w:sz w:val="20"/>
+          <w:szCs w:val="20"/>
+          <w:highlight w:val="white"/>
+          <w:rtl w:val="0"/>
+        </w:rPr>
+        <w:t xml:space="preserve"> Material UI</w:t>
+      </w:r>
+      <w:r>
+        <w:rPr>
+          <w:sz w:val="20"/>
+          <w:szCs w:val="20"/>
+          <w:highlight w:val="white"/>
+          <w:rtl w:val="0"/>
+        </w:rPr>
+        <w:t xml:space="preserve">,</w:t>
+      </w:r>
+      <w:r>
+        <w:rPr>
+          <w:sz w:val="20"/>
+          <w:szCs w:val="20"/>
+          <w:highlight w:val="white"/>
+          <w:rtl w:val="0"/>
+        </w:rPr>
+        <w:t xml:space="preserve"> shadcnui</w:t>
+      </w:r>
+    </w:p>
+    <w:p>
+      <w:pPr>
         <w:numPr>
           <w:ilvl w:val="0"/>
           <w:numId w:val="1"/>
         </w:numPr>
-        <w:pBdr>
-          <w:top w:space="0" w:sz="0" w:val="nil"/>
-          <w:left w:space="0" w:sz="0" w:val="nil"/>
-          <w:bottom w:space="0" w:sz="0" w:val="nil"/>
-          <w:right w:space="0" w:sz="0" w:val="nil"/>
-          <w:between w:space="0" w:sz="0" w:val="nil"/>
-        </w:pBdr>
-        <w:shd w:fill="auto" w:val="clear"/>
-        <w:spacing w:after="0" w:before="0" w:line="276" w:lineRule="auto"/>
-        <w:ind w:left="720" w:right="0" w:hanging="360"/>
-        <w:jc w:val="left"/>
+        <w:spacing w:after="0" w:line="240" w:lineRule="auto"/>
+        <w:ind w:left="720" w:hanging="360"/>
         <w:rPr>
           <w:rFonts w:ascii="Calibri" w:cs="Calibri" w:eastAsia="Calibri" w:hAnsi="Calibri"/>
-          <w:i w:val="0"/>
-          <w:iCs w:val="0"/>
-          <w:smallCaps w:val="0"/>
-          <w:strike w:val="0"/>
-          <w:sz w:val="20"/>
-          <w:szCs w:val="20"/>
-          <w:shd w:fill="auto" w:val="clear"/>
-          <w:vertAlign w:val="baseline"/>
-        </w:rPr>
-      </w:pPr>
-      <w:r>
-        <w:rPr>
-          <w:i w:val="0"/>
-          <w:iCs w:val="0"/>
-          <w:smallCaps w:val="0"/>
-          <w:strike w:val="0"/>
-          <w:sz w:val="20"/>
-          <w:szCs w:val="20"/>
-          <w:u w:val="none"/>
-          <w:shd w:fill="auto" w:val="clear"/>
-          <w:vertAlign w:val="baseline"/>
-          <w:rtl w:val="0"/>
-        </w:rPr>
-        <w:t xml:space="preserve">Cypress, Playwright, Jest</w:t>
+          <w:sz w:val="20"/>
+          <w:szCs w:val="20"/>
+          <w:highlight w:val="white"/>
+        </w:rPr>
+      </w:pPr>
+      <w:r>
+        <w:rPr>
+          <w:sz w:val="20"/>
+          <w:szCs w:val="20"/>
+          <w:highlight w:val="white"/>
+          <w:rtl w:val="0"/>
+        </w:rPr>
+        <w:t xml:space="preserve">REST API, GraphQL</w:t>
+      </w:r>
+    </w:p>
+    <w:p>
+      <w:pPr>
+        <w:numPr>
+          <w:ilvl w:val="0"/>
+          <w:numId w:val="1"/>
+        </w:numPr>
+        <w:spacing w:after="0" w:line="240" w:lineRule="auto"/>
+        <w:ind w:left="720" w:hanging="360"/>
+        <w:rPr>
+          <w:rFonts w:ascii="Calibri" w:cs="Calibri" w:eastAsia="Calibri" w:hAnsi="Calibri"/>
+          <w:sz w:val="20"/>
+          <w:szCs w:val="20"/>
+          <w:highlight w:val="white"/>
+        </w:rPr>
+      </w:pPr>
+      <w:r>
+        <w:rPr>
+          <w:sz w:val="20"/>
+          <w:szCs w:val="20"/>
+          <w:highlight w:val="white"/>
+          <w:rtl w:val="0"/>
+        </w:rPr>
+        <w:t xml:space="preserve">React Hook Form, ZOD, Redux, Zustand</w:t>
+      </w:r>
+    </w:p>
+    <w:p>
+      <w:pPr>
+        <w:numPr>
+          <w:ilvl w:val="0"/>
+          <w:numId w:val="1"/>
+        </w:numPr>
+        <w:spacing w:after="0" w:line="240" w:lineRule="auto"/>
+        <w:ind w:left="720" w:hanging="360"/>
+        <w:rPr>
+          <w:rFonts w:ascii="Calibri" w:cs="Calibri" w:eastAsia="Calibri" w:hAnsi="Calibri"/>
+          <w:sz w:val="20"/>
+          <w:szCs w:val="20"/>
+          <w:highlight w:val="white"/>
+        </w:rPr>
+      </w:pPr>
+      <w:r>
+        <w:rPr>
+          <w:sz w:val="20"/>
+          <w:szCs w:val="20"/>
+          <w:highlight w:val="white"/>
+          <w:rtl w:val="0"/>
+        </w:rPr>
+        <w:t xml:space="preserve">CI/CD</w:t>
+      </w:r>
+      <w:r>
+        <w:rPr>
+          <w:sz w:val="20"/>
+          <w:szCs w:val="20"/>
+          <w:highlight w:val="white"/>
+          <w:rtl w:val="0"/>
+        </w:rPr>
+        <w:t xml:space="preserve">,</w:t>
+      </w:r>
+      <w:r>
+        <w:rPr>
+          <w:sz w:val="20"/>
+          <w:szCs w:val="20"/>
+          <w:highlight w:val="white"/>
+          <w:rtl w:val="0"/>
+        </w:rPr>
+        <w:t xml:space="preserve"> GitHub Actions</w:t>
+      </w:r>
+      <w:r>
+        <w:rPr>
+          <w:sz w:val="20"/>
+          <w:szCs w:val="20"/>
+          <w:highlight w:val="white"/>
+          <w:rtl w:val="0"/>
+        </w:rPr>
+        <w:t xml:space="preserve">, </w:t>
+      </w:r>
+      <w:r>
+        <w:rPr>
+          <w:sz w:val="20"/>
+          <w:szCs w:val="20"/>
+          <w:highlight w:val="white"/>
+          <w:rtl w:val="0"/>
+        </w:rPr>
+        <w:t xml:space="preserve">Vercel</w:t>
+      </w:r>
+      <w:r>
+        <w:rPr>
+          <w:sz w:val="20"/>
+          <w:szCs w:val="20"/>
+          <w:highlight w:val="white"/>
+          <w:rtl w:val="0"/>
+        </w:rPr>
+        <w:t xml:space="preserve">, </w:t>
+      </w:r>
+      <w:r>
+        <w:rPr>
+          <w:sz w:val="20"/>
+          <w:szCs w:val="20"/>
+          <w:highlight w:val="white"/>
+          <w:rtl w:val="0"/>
+        </w:rPr>
+        <w:t xml:space="preserve">Netlify</w:t>
+      </w:r>
+      <w:r>
+        <w:rPr>
+          <w:rtl w:val="0"/>
+        </w:rPr>
+      </w:r>
+    </w:p>
+    <w:p>
+      <w:pPr>
+        <w:numPr>
+          <w:ilvl w:val="0"/>
+          <w:numId w:val="1"/>
+        </w:numPr>
+        <w:spacing w:after="0" w:line="240" w:lineRule="auto"/>
+        <w:ind w:left="720" w:hanging="360"/>
+        <w:rPr>
+          <w:rFonts w:ascii="Calibri" w:cs="Calibri" w:eastAsia="Calibri" w:hAnsi="Calibri"/>
+          <w:sz w:val="20"/>
+          <w:szCs w:val="20"/>
+          <w:highlight w:val="white"/>
+        </w:rPr>
+      </w:pPr>
+      <w:r>
+        <w:rPr>
+          <w:sz w:val="20"/>
+          <w:szCs w:val="20"/>
+          <w:highlight w:val="white"/>
+          <w:rtl w:val="0"/>
+        </w:rPr>
+        <w:t xml:space="preserve">Cypress</w:t>
+      </w:r>
+      <w:r>
+        <w:rPr>
+          <w:sz w:val="20"/>
+          <w:szCs w:val="20"/>
+          <w:highlight w:val="white"/>
+          <w:rtl w:val="0"/>
+        </w:rPr>
+        <w:t xml:space="preserve">, </w:t>
+      </w:r>
+      <w:r>
+        <w:rPr>
+          <w:sz w:val="20"/>
+          <w:szCs w:val="20"/>
+          <w:highlight w:val="white"/>
+          <w:rtl w:val="0"/>
+        </w:rPr>
+        <w:t xml:space="preserve">Playwright</w:t>
+      </w:r>
+      <w:r>
+        <w:rPr>
+          <w:sz w:val="20"/>
+          <w:szCs w:val="20"/>
+          <w:highlight w:val="white"/>
+          <w:rtl w:val="0"/>
+        </w:rPr>
+        <w:t xml:space="preserve">, </w:t>
+      </w:r>
+      <w:r>
+        <w:rPr>
+          <w:sz w:val="20"/>
+          <w:szCs w:val="20"/>
+          <w:highlight w:val="white"/>
+          <w:rtl w:val="0"/>
+        </w:rPr>
+        <w:t xml:space="preserve">Jest</w:t>
+      </w:r>
+    </w:p>
+    <w:p>
+      <w:pPr>
+        <w:numPr>
+          <w:ilvl w:val="0"/>
+          <w:numId w:val="1"/>
+        </w:numPr>
+        <w:spacing w:after="0" w:line="240" w:lineRule="auto"/>
+        <w:ind w:left="720" w:hanging="360"/>
+        <w:rPr>
+          <w:rFonts w:ascii="Calibri" w:cs="Calibri" w:eastAsia="Calibri" w:hAnsi="Calibri"/>
+          <w:sz w:val="20"/>
+          <w:szCs w:val="20"/>
+          <w:highlight w:val="white"/>
+        </w:rPr>
+      </w:pPr>
+      <w:r>
+        <w:rPr>
+          <w:sz w:val="20"/>
+          <w:szCs w:val="20"/>
+          <w:highlight w:val="white"/>
+          <w:rtl w:val="0"/>
+        </w:rPr>
+        <w:t xml:space="preserve">Adobe XD</w:t>
+      </w:r>
+      <w:r>
+        <w:rPr>
+          <w:sz w:val="20"/>
+          <w:szCs w:val="20"/>
+          <w:highlight w:val="white"/>
+          <w:rtl w:val="0"/>
+        </w:rPr>
+        <w:t xml:space="preserve">, </w:t>
+      </w:r>
+      <w:r>
+        <w:rPr>
+          <w:sz w:val="20"/>
+          <w:szCs w:val="20"/>
+          <w:highlight w:val="white"/>
+          <w:rtl w:val="0"/>
+        </w:rPr>
+        <w:t xml:space="preserve">Figma</w:t>
+      </w:r>
+      <w:r>
+        <w:rPr>
+          <w:sz w:val="20"/>
+          <w:szCs w:val="20"/>
+          <w:highlight w:val="white"/>
+          <w:rtl w:val="0"/>
+        </w:rPr>
+        <w:t xml:space="preserve">,</w:t>
+      </w:r>
+      <w:r>
+        <w:rPr>
+          <w:sz w:val="20"/>
+          <w:szCs w:val="20"/>
+          <w:highlight w:val="white"/>
+          <w:rtl w:val="0"/>
+        </w:rPr>
+        <w:t xml:space="preserve"> Storybook</w:t>
       </w:r>
       <w:r>
         <w:rPr>
@@ -3304,47 +3266,16 @@
           <w:vertAlign w:val="baseline"/>
           <w:rtl w:val="0"/>
         </w:rPr>
-        <w:t xml:space="preserve">Czech: Native</w:t>
-      </w:r>
-      <w:r>
-        <w:rPr>
-          <w:rtl w:val="0"/>
-        </w:rPr>
-      </w:r>
-    </w:p>
-    <w:p>
-      <w:pPr>
-        <w:keepNext w:val="0"/>
-        <w:keepLines w:val="0"/>
-        <w:pageBreakBefore w:val="0"/>
-        <w:widowControl w:val="1"/>
-        <w:numPr>
-          <w:ilvl w:val="0"/>
-          <w:numId w:val="7"/>
-        </w:numPr>
-        <w:pBdr>
-          <w:top w:space="0" w:sz="0" w:val="nil"/>
-          <w:left w:space="0" w:sz="0" w:val="nil"/>
-          <w:bottom w:space="0" w:sz="0" w:val="nil"/>
-          <w:right w:space="0" w:sz="0" w:val="nil"/>
-          <w:between w:space="0" w:sz="0" w:val="nil"/>
-        </w:pBdr>
-        <w:shd w:fill="auto" w:val="clear"/>
-        <w:spacing w:after="200" w:before="0" w:line="276" w:lineRule="auto"/>
-        <w:ind w:left="720" w:right="0" w:hanging="360"/>
-        <w:jc w:val="left"/>
-        <w:rPr>
-          <w:rFonts w:ascii="Calibri" w:cs="Calibri" w:eastAsia="Calibri" w:hAnsi="Calibri"/>
-          <w:i w:val="0"/>
-          <w:iCs w:val="0"/>
-          <w:smallCaps w:val="0"/>
-          <w:strike w:val="0"/>
-          <w:sz w:val="20"/>
-          <w:szCs w:val="20"/>
-          <w:shd w:fill="auto" w:val="clear"/>
-          <w:vertAlign w:val="baseline"/>
-        </w:rPr>
-      </w:pPr>
+        <w:t xml:space="preserve">Czech </w:t>
+      </w:r>
+      <w:r>
+        <w:rPr>
+          <w:sz w:val="16"/>
+          <w:szCs w:val="16"/>
+          <w:rtl w:val="0"/>
+        </w:rPr>
+        <w:t xml:space="preserve">&amp;</w:t>
+      </w:r>
       <w:r>
         <w:rPr>
           <w:i w:val="0"/>
@@ -3358,7 +3289,7 @@
           <w:vertAlign w:val="baseline"/>
           <w:rtl w:val="0"/>
         </w:rPr>
-        <w:t xml:space="preserve">Slovak: Native</w:t>
+        <w:t xml:space="preserve"> Slovak: Native</w:t>
       </w:r>
       <w:r>
         <w:rPr>

</xml_diff>

<commit_message>
refactor(cv): 👷 update resume (#810)
</commit_message>
<xml_diff>
--- a/public/downloads/resume-daniel-krsiak.docx
+++ b/public/downloads/resume-daniel-krsiak.docx
@@ -8,16 +8,16 @@
         <w:rPr>
           <w:b w:val="1"/>
           <w:bCs w:val="1"/>
-          <w:sz w:val="20"/>
-          <w:szCs w:val="20"/>
-        </w:rPr>
-      </w:pPr>
-      <w:r>
-        <w:rPr>
-          <w:b w:val="1"/>
-          <w:bCs w:val="1"/>
-          <w:sz w:val="20"/>
-          <w:szCs w:val="20"/>
+          <w:sz w:val="24"/>
+          <w:szCs w:val="24"/>
+        </w:rPr>
+      </w:pPr>
+      <w:r>
+        <w:rPr>
+          <w:b w:val="1"/>
+          <w:bCs w:val="1"/>
+          <w:sz w:val="24"/>
+          <w:szCs w:val="24"/>
           <w:rtl w:val="0"/>
         </w:rPr>
         <w:t xml:space="preserve">DANIEL KRSIAK</w:t>
@@ -203,7 +203,6 @@
             <w:iCs w:val="0"/>
             <w:smallCaps w:val="0"/>
             <w:strike w:val="0"/>
-            <w:color w:val="1155cc"/>
             <w:sz w:val="20"/>
             <w:szCs w:val="20"/>
             <w:u w:val="single"/>
@@ -275,7 +274,6 @@
             <w:iCs w:val="0"/>
             <w:smallCaps w:val="0"/>
             <w:strike w:val="0"/>
-            <w:color w:val="1155cc"/>
             <w:sz w:val="20"/>
             <w:szCs w:val="20"/>
             <w:u w:val="single"/>
@@ -347,7 +345,6 @@
             <w:iCs w:val="0"/>
             <w:smallCaps w:val="0"/>
             <w:strike w:val="0"/>
-            <w:color w:val="1155cc"/>
             <w:sz w:val="20"/>
             <w:szCs w:val="20"/>
             <w:u w:val="single"/>
@@ -370,16 +367,16 @@
         <w:rPr>
           <w:b w:val="1"/>
           <w:bCs w:val="1"/>
-          <w:sz w:val="20"/>
-          <w:szCs w:val="20"/>
-        </w:rPr>
-      </w:pPr>
-      <w:r>
-        <w:rPr>
-          <w:b w:val="1"/>
-          <w:bCs w:val="1"/>
-          <w:sz w:val="20"/>
-          <w:szCs w:val="20"/>
+          <w:sz w:val="24"/>
+          <w:szCs w:val="24"/>
+        </w:rPr>
+      </w:pPr>
+      <w:r>
+        <w:rPr>
+          <w:b w:val="1"/>
+          <w:bCs w:val="1"/>
+          <w:sz w:val="24"/>
+          <w:szCs w:val="24"/>
           <w:rtl w:val="0"/>
         </w:rPr>
         <w:t xml:space="preserve">SUMMARY</w:t>
@@ -387,19 +384,19 @@
     </w:p>
     <w:p>
       <w:pPr>
-        <w:spacing w:after="0" w:lineRule="auto"/>
-        <w:rPr>
-          <w:sz w:val="20"/>
-          <w:szCs w:val="20"/>
-        </w:rPr>
-      </w:pPr>
-      <w:r>
-        <w:rPr>
-          <w:sz w:val="20"/>
-          <w:szCs w:val="20"/>
-          <w:rtl w:val="0"/>
-        </w:rPr>
-        <w:t xml:space="preserve">React Developer with 7+ years of experience building responsive and scalable web applications.</w:t>
+        <w:spacing w:after="0" w:before="200" w:lineRule="auto"/>
+        <w:rPr>
+          <w:sz w:val="20"/>
+          <w:szCs w:val="20"/>
+        </w:rPr>
+      </w:pPr>
+      <w:r>
+        <w:rPr>
+          <w:sz w:val="20"/>
+          <w:szCs w:val="20"/>
+          <w:rtl w:val="0"/>
+        </w:rPr>
+        <w:t xml:space="preserve">React Developer with 7+ years of experience, building responsive, AI-powered, and scalable web applications.</w:t>
       </w:r>
     </w:p>
     <w:p>
@@ -426,20 +423,20 @@
     </w:p>
     <w:p>
       <w:pPr>
-        <w:spacing w:after="0" w:before="240" w:lineRule="auto"/>
-        <w:rPr>
-          <w:b w:val="1"/>
-          <w:bCs w:val="1"/>
-          <w:sz w:val="20"/>
-          <w:szCs w:val="20"/>
-        </w:rPr>
-      </w:pPr>
-      <w:r>
-        <w:rPr>
-          <w:b w:val="1"/>
-          <w:bCs w:val="1"/>
-          <w:sz w:val="20"/>
-          <w:szCs w:val="20"/>
+        <w:spacing w:after="0" w:before="240" w:line="240" w:lineRule="auto"/>
+        <w:rPr>
+          <w:b w:val="1"/>
+          <w:bCs w:val="1"/>
+          <w:sz w:val="24"/>
+          <w:szCs w:val="24"/>
+        </w:rPr>
+      </w:pPr>
+      <w:r>
+        <w:rPr>
+          <w:b w:val="1"/>
+          <w:bCs w:val="1"/>
+          <w:sz w:val="24"/>
+          <w:szCs w:val="24"/>
           <w:rtl w:val="0"/>
         </w:rPr>
         <w:t xml:space="preserve">EXPERIENCE</w:t>
@@ -447,7 +444,7 @@
     </w:p>
     <w:p>
       <w:pPr>
-        <w:spacing w:after="0" w:before="240" w:lineRule="auto"/>
+        <w:spacing w:after="0" w:before="200" w:line="240" w:lineRule="auto"/>
         <w:rPr>
           <w:b w:val="1"/>
           <w:bCs w:val="1"/>
@@ -486,7 +483,7 @@
           <w:szCs w:val="20"/>
           <w:rtl w:val="0"/>
         </w:rPr>
-        <w:t xml:space="preserve">1 year, Jul 2025 – Feb 2026</w:t>
+        <w:t xml:space="preserve">1 year, Jul 2025 – Jun 2026</w:t>
       </w:r>
       <w:r>
         <w:rPr>
@@ -510,12 +507,63 @@
       </w:pPr>
       <w:r>
         <w:rPr>
+          <w:b w:val="1"/>
+          <w:bCs w:val="1"/>
           <w:sz w:val="20"/>
           <w:szCs w:val="20"/>
           <w:highlight w:val="white"/>
           <w:rtl w:val="0"/>
         </w:rPr>
-        <w:t xml:space="preserve">Developed AI-powered chat and AI Public Tenders Dashboards with document analysis.</w:t>
+        <w:t xml:space="preserve">Developed</w:t>
+      </w:r>
+      <w:r>
+        <w:rPr>
+          <w:sz w:val="20"/>
+          <w:szCs w:val="20"/>
+          <w:highlight w:val="white"/>
+          <w:rtl w:val="0"/>
+        </w:rPr>
+        <w:t xml:space="preserve"> </w:t>
+      </w:r>
+      <w:r>
+        <w:rPr>
+          <w:b w:val="1"/>
+          <w:bCs w:val="1"/>
+          <w:sz w:val="20"/>
+          <w:szCs w:val="20"/>
+          <w:highlight w:val="white"/>
+          <w:rtl w:val="0"/>
+        </w:rPr>
+        <w:t xml:space="preserve">AI-powered chat</w:t>
+      </w:r>
+      <w:r>
+        <w:rPr>
+          <w:sz w:val="20"/>
+          <w:szCs w:val="20"/>
+          <w:highlight w:val="white"/>
+          <w:rtl w:val="0"/>
+        </w:rPr>
+        <w:t xml:space="preserve"> and </w:t>
+      </w:r>
+      <w:r>
+        <w:rPr>
+          <w:b w:val="1"/>
+          <w:bCs w:val="1"/>
+          <w:sz w:val="20"/>
+          <w:szCs w:val="20"/>
+          <w:highlight w:val="white"/>
+          <w:rtl w:val="0"/>
+        </w:rPr>
+        <w:t xml:space="preserve">AI Public Tenders Dashboards</w:t>
+      </w:r>
+      <w:r>
+        <w:rPr>
+          <w:sz w:val="20"/>
+          <w:szCs w:val="20"/>
+          <w:highlight w:val="white"/>
+          <w:rtl w:val="0"/>
+        </w:rPr>
+        <w:t xml:space="preserve"> with document analysis.</w:t>
       </w:r>
       <w:r>
         <w:rPr>
@@ -542,7 +590,7 @@
           <w:szCs w:val="20"/>
           <w:rtl w:val="0"/>
         </w:rPr>
-        <w:t xml:space="preserve">React, TypeScript, Next.js, Material UI, React Hook Form, Zod, GraphQL, Zustand, Figma, Jira.</w:t>
+        <w:t xml:space="preserve">React, TypeScript, Next.js, MUI, React Hook Form, Zod, GraphQL, Zustand, Figma, Jira, Copilot, Claude.</w:t>
       </w:r>
       <w:r>
         <w:rPr>
@@ -808,11 +856,21 @@
       </w:pPr>
       <w:r>
         <w:rPr>
-          <w:sz w:val="20"/>
-          <w:szCs w:val="20"/>
-          <w:rtl w:val="0"/>
-        </w:rPr>
-        <w:t xml:space="preserve">Developed an internal insurance application for employees to manage insurance policies.</w:t>
+          <w:b w:val="1"/>
+          <w:bCs w:val="1"/>
+          <w:sz w:val="20"/>
+          <w:szCs w:val="20"/>
+          <w:rtl w:val="0"/>
+        </w:rPr>
+        <w:t xml:space="preserve">Developed an internal insurance application</w:t>
+      </w:r>
+      <w:r>
+        <w:rPr>
+          <w:sz w:val="20"/>
+          <w:szCs w:val="20"/>
+          <w:rtl w:val="0"/>
+        </w:rPr>
+        <w:t xml:space="preserve"> for employees to manage insurance policies.</w:t>
       </w:r>
       <w:r>
         <w:rPr>
@@ -1084,11 +1142,21 @@
       </w:pPr>
       <w:r>
         <w:rPr>
-          <w:sz w:val="20"/>
-          <w:szCs w:val="20"/>
-          <w:rtl w:val="0"/>
-        </w:rPr>
-        <w:t xml:space="preserve">Developed “Branches &amp; ATM locator” for the Czech 3rd-largest bank, serving 2M+ customers.</w:t>
+          <w:b w:val="1"/>
+          <w:bCs w:val="1"/>
+          <w:sz w:val="20"/>
+          <w:szCs w:val="20"/>
+          <w:rtl w:val="0"/>
+        </w:rPr>
+        <w:t xml:space="preserve">Developed “Branches &amp; ATM locator”</w:t>
+      </w:r>
+      <w:r>
+        <w:rPr>
+          <w:sz w:val="20"/>
+          <w:szCs w:val="20"/>
+          <w:rtl w:val="0"/>
+        </w:rPr>
+        <w:t xml:space="preserve"> for the Czech 3rd-largest bank, serving 2M+ customers.</w:t>
       </w:r>
       <w:r>
         <w:rPr>
@@ -1222,11 +1290,21 @@
       </w:pPr>
       <w:r>
         <w:rPr>
-          <w:sz w:val="20"/>
-          <w:szCs w:val="20"/>
-          <w:rtl w:val="0"/>
-        </w:rPr>
-        <w:t xml:space="preserve">Developed a customer care dashboard with chat support, used by 100,000 businesses worldwide</w:t>
+          <w:b w:val="1"/>
+          <w:bCs w:val="1"/>
+          <w:sz w:val="20"/>
+          <w:szCs w:val="20"/>
+          <w:rtl w:val="0"/>
+        </w:rPr>
+        <w:t xml:space="preserve">Developed a customer care dashboard</w:t>
+      </w:r>
+      <w:r>
+        <w:rPr>
+          <w:sz w:val="20"/>
+          <w:szCs w:val="20"/>
+          <w:rtl w:val="0"/>
+        </w:rPr>
+        <w:t xml:space="preserve"> with chat support, used by 100,000 businesses worldwide</w:t>
       </w:r>
       <w:r>
         <w:rPr>
@@ -1379,6 +1457,8 @@
       </w:pPr>
       <w:r>
         <w:rPr>
+          <w:b w:val="1"/>
+          <w:bCs w:val="1"/>
           <w:i w:val="0"/>
           <w:iCs w:val="0"/>
           <w:smallCaps w:val="0"/>
@@ -1390,7 +1470,22 @@
           <w:vertAlign w:val="baseline"/>
           <w:rtl w:val="0"/>
         </w:rPr>
-        <w:t xml:space="preserve">Developed company website with PHP, JavaScript, and SASS, using responsive design.</w:t>
+        <w:t xml:space="preserve">Developed company website</w:t>
+      </w:r>
+      <w:r>
+        <w:rPr>
+          <w:i w:val="0"/>
+          <w:iCs w:val="0"/>
+          <w:smallCaps w:val="0"/>
+          <w:strike w:val="0"/>
+          <w:sz w:val="20"/>
+          <w:szCs w:val="20"/>
+          <w:u w:val="none"/>
+          <w:shd w:fill="auto" w:val="clear"/>
+          <w:vertAlign w:val="baseline"/>
+          <w:rtl w:val="0"/>
+        </w:rPr>
+        <w:t xml:space="preserve"> with PHP, JavaScript, and SASS, using responsive design.</w:t>
       </w:r>
       <w:r>
         <w:rPr>
@@ -2273,48 +2368,22 @@
     </w:p>
     <w:p>
       <w:pPr>
-        <w:keepNext w:val="0"/>
-        <w:keepLines w:val="0"/>
-        <w:pageBreakBefore w:val="0"/>
-        <w:widowControl w:val="1"/>
         <w:numPr>
           <w:ilvl w:val="0"/>
           <w:numId w:val="1"/>
         </w:numPr>
-        <w:pBdr>
-          <w:top w:space="0" w:sz="0" w:val="nil"/>
-          <w:left w:space="0" w:sz="0" w:val="nil"/>
-          <w:bottom w:space="0" w:sz="0" w:val="nil"/>
-          <w:right w:space="0" w:sz="0" w:val="nil"/>
-          <w:between w:space="0" w:sz="0" w:val="nil"/>
-        </w:pBdr>
-        <w:shd w:fill="auto" w:val="clear"/>
-        <w:spacing w:after="0" w:before="0" w:line="276" w:lineRule="auto"/>
-        <w:ind w:left="720" w:right="0" w:hanging="360"/>
-        <w:jc w:val="left"/>
+        <w:spacing w:after="0" w:line="240" w:lineRule="auto"/>
+        <w:ind w:left="720" w:hanging="360"/>
         <w:rPr>
           <w:rFonts w:ascii="Calibri" w:cs="Calibri" w:eastAsia="Calibri" w:hAnsi="Calibri"/>
-          <w:i w:val="0"/>
-          <w:iCs w:val="0"/>
-          <w:smallCaps w:val="0"/>
-          <w:strike w:val="0"/>
-          <w:sz w:val="20"/>
-          <w:szCs w:val="20"/>
-          <w:shd w:fill="auto" w:val="clear"/>
-          <w:vertAlign w:val="baseline"/>
-        </w:rPr>
-      </w:pPr>
-      <w:r>
-        <w:rPr>
-          <w:i w:val="0"/>
-          <w:iCs w:val="0"/>
-          <w:smallCaps w:val="0"/>
-          <w:strike w:val="0"/>
-          <w:sz w:val="20"/>
-          <w:szCs w:val="20"/>
-          <w:u w:val="none"/>
-          <w:shd w:fill="auto" w:val="clear"/>
-          <w:vertAlign w:val="baseline"/>
+          <w:sz w:val="20"/>
+          <w:szCs w:val="20"/>
+        </w:rPr>
+      </w:pPr>
+      <w:r>
+        <w:rPr>
+          <w:sz w:val="20"/>
+          <w:szCs w:val="20"/>
           <w:rtl w:val="0"/>
         </w:rPr>
         <w:t xml:space="preserve">JavaScript</w:t>
@@ -2325,96 +2394,32 @@
           <w:szCs w:val="20"/>
           <w:rtl w:val="0"/>
         </w:rPr>
-        <w:t xml:space="preserve">:</w:t>
-      </w:r>
-      <w:r>
-        <w:rPr>
-          <w:i w:val="0"/>
-          <w:iCs w:val="0"/>
-          <w:smallCaps w:val="0"/>
-          <w:strike w:val="0"/>
-          <w:sz w:val="20"/>
-          <w:szCs w:val="20"/>
-          <w:u w:val="none"/>
-          <w:shd w:fill="auto" w:val="clear"/>
-          <w:vertAlign w:val="baseline"/>
-          <w:rtl w:val="0"/>
-        </w:rPr>
-        <w:t xml:space="preserve"> </w:t>
-      </w:r>
-      <w:r>
-        <w:rPr>
-          <w:sz w:val="20"/>
-          <w:szCs w:val="20"/>
-          <w:rtl w:val="0"/>
-        </w:rPr>
-        <w:t xml:space="preserve">8</w:t>
-      </w:r>
-      <w:r>
-        <w:rPr>
-          <w:i w:val="0"/>
-          <w:iCs w:val="0"/>
-          <w:smallCaps w:val="0"/>
-          <w:strike w:val="0"/>
-          <w:sz w:val="20"/>
-          <w:szCs w:val="20"/>
-          <w:u w:val="none"/>
-          <w:shd w:fill="auto" w:val="clear"/>
-          <w:vertAlign w:val="baseline"/>
-          <w:rtl w:val="0"/>
-        </w:rPr>
-        <w:t xml:space="preserve"> years</w:t>
-      </w:r>
-      <w:r>
-        <w:rPr>
-          <w:rtl w:val="0"/>
-        </w:rPr>
-      </w:r>
-    </w:p>
-    <w:p>
-      <w:pPr>
-        <w:keepNext w:val="0"/>
-        <w:keepLines w:val="0"/>
-        <w:pageBreakBefore w:val="0"/>
-        <w:widowControl w:val="1"/>
+        <w:t xml:space="preserve"> – 8 years </w:t>
+      </w:r>
+      <w:r>
+        <w:rPr>
+          <w:rtl w:val="0"/>
+        </w:rPr>
+      </w:r>
+    </w:p>
+    <w:p>
+      <w:pPr>
         <w:numPr>
           <w:ilvl w:val="0"/>
           <w:numId w:val="1"/>
         </w:numPr>
-        <w:pBdr>
-          <w:top w:space="0" w:sz="0" w:val="nil"/>
-          <w:left w:space="0" w:sz="0" w:val="nil"/>
-          <w:bottom w:space="0" w:sz="0" w:val="nil"/>
-          <w:right w:space="0" w:sz="0" w:val="nil"/>
-          <w:between w:space="0" w:sz="0" w:val="nil"/>
-        </w:pBdr>
-        <w:shd w:fill="auto" w:val="clear"/>
-        <w:spacing w:after="0" w:before="0" w:line="276" w:lineRule="auto"/>
-        <w:ind w:left="720" w:right="0" w:hanging="360"/>
-        <w:jc w:val="left"/>
+        <w:spacing w:after="0" w:line="240" w:lineRule="auto"/>
+        <w:ind w:left="720" w:hanging="360"/>
         <w:rPr>
           <w:rFonts w:ascii="Calibri" w:cs="Calibri" w:eastAsia="Calibri" w:hAnsi="Calibri"/>
-          <w:i w:val="0"/>
-          <w:iCs w:val="0"/>
-          <w:smallCaps w:val="0"/>
-          <w:strike w:val="0"/>
-          <w:sz w:val="20"/>
-          <w:szCs w:val="20"/>
-          <w:shd w:fill="auto" w:val="clear"/>
-          <w:vertAlign w:val="baseline"/>
-        </w:rPr>
-      </w:pPr>
-      <w:r>
-        <w:rPr>
-          <w:i w:val="0"/>
-          <w:iCs w:val="0"/>
-          <w:smallCaps w:val="0"/>
-          <w:strike w:val="0"/>
-          <w:sz w:val="20"/>
-          <w:szCs w:val="20"/>
-          <w:u w:val="none"/>
-          <w:shd w:fill="auto" w:val="clear"/>
-          <w:vertAlign w:val="baseline"/>
+          <w:sz w:val="20"/>
+          <w:szCs w:val="20"/>
+        </w:rPr>
+      </w:pPr>
+      <w:r>
+        <w:rPr>
+          <w:sz w:val="20"/>
+          <w:szCs w:val="20"/>
           <w:rtl w:val="0"/>
         </w:rPr>
         <w:t xml:space="preserve">TypeScript</w:t>
@@ -2425,104 +2430,32 @@
           <w:szCs w:val="20"/>
           <w:rtl w:val="0"/>
         </w:rPr>
-        <w:t xml:space="preserve">:</w:t>
-      </w:r>
-      <w:r>
-        <w:rPr>
-          <w:i w:val="0"/>
-          <w:iCs w:val="0"/>
-          <w:smallCaps w:val="0"/>
-          <w:strike w:val="0"/>
-          <w:sz w:val="20"/>
-          <w:szCs w:val="20"/>
-          <w:u w:val="none"/>
-          <w:shd w:fill="auto" w:val="clear"/>
-          <w:vertAlign w:val="baseline"/>
-          <w:rtl w:val="0"/>
-        </w:rPr>
-        <w:t xml:space="preserve"> </w:t>
-      </w:r>
-      <w:r>
-        <w:rPr>
-          <w:sz w:val="20"/>
-          <w:szCs w:val="20"/>
-          <w:rtl w:val="0"/>
-        </w:rPr>
-        <w:t xml:space="preserve">7</w:t>
-      </w:r>
-      <w:r>
-        <w:rPr>
-          <w:i w:val="0"/>
-          <w:iCs w:val="0"/>
-          <w:smallCaps w:val="0"/>
-          <w:strike w:val="0"/>
-          <w:sz w:val="20"/>
-          <w:szCs w:val="20"/>
-          <w:u w:val="none"/>
-          <w:shd w:fill="auto" w:val="clear"/>
-          <w:vertAlign w:val="baseline"/>
-          <w:rtl w:val="0"/>
-        </w:rPr>
-        <w:t xml:space="preserve"> year</w:t>
-      </w:r>
-      <w:r>
-        <w:rPr>
-          <w:sz w:val="20"/>
-          <w:szCs w:val="20"/>
-          <w:rtl w:val="0"/>
-        </w:rPr>
-        <w:t xml:space="preserve">s</w:t>
-      </w:r>
-      <w:r>
-        <w:rPr>
-          <w:rtl w:val="0"/>
-        </w:rPr>
-      </w:r>
-    </w:p>
-    <w:p>
-      <w:pPr>
-        <w:keepNext w:val="0"/>
-        <w:keepLines w:val="0"/>
-        <w:pageBreakBefore w:val="0"/>
-        <w:widowControl w:val="1"/>
+        <w:t xml:space="preserve"> – 7 years</w:t>
+      </w:r>
+      <w:r>
+        <w:rPr>
+          <w:rtl w:val="0"/>
+        </w:rPr>
+      </w:r>
+    </w:p>
+    <w:p>
+      <w:pPr>
         <w:numPr>
           <w:ilvl w:val="0"/>
           <w:numId w:val="1"/>
         </w:numPr>
-        <w:pBdr>
-          <w:top w:space="0" w:sz="0" w:val="nil"/>
-          <w:left w:space="0" w:sz="0" w:val="nil"/>
-          <w:bottom w:space="0" w:sz="0" w:val="nil"/>
-          <w:right w:space="0" w:sz="0" w:val="nil"/>
-          <w:between w:space="0" w:sz="0" w:val="nil"/>
-        </w:pBdr>
-        <w:shd w:fill="auto" w:val="clear"/>
-        <w:spacing w:after="0" w:before="0" w:line="276" w:lineRule="auto"/>
-        <w:ind w:left="720" w:right="0" w:hanging="360"/>
-        <w:jc w:val="left"/>
+        <w:spacing w:after="0" w:line="240" w:lineRule="auto"/>
+        <w:ind w:left="720" w:hanging="360"/>
         <w:rPr>
           <w:rFonts w:ascii="Calibri" w:cs="Calibri" w:eastAsia="Calibri" w:hAnsi="Calibri"/>
-          <w:i w:val="0"/>
-          <w:iCs w:val="0"/>
-          <w:smallCaps w:val="0"/>
-          <w:strike w:val="0"/>
-          <w:sz w:val="20"/>
-          <w:szCs w:val="20"/>
-          <w:shd w:fill="auto" w:val="clear"/>
-          <w:vertAlign w:val="baseline"/>
-        </w:rPr>
-      </w:pPr>
-      <w:r>
-        <w:rPr>
-          <w:i w:val="0"/>
-          <w:iCs w:val="0"/>
-          <w:smallCaps w:val="0"/>
-          <w:strike w:val="0"/>
-          <w:sz w:val="20"/>
-          <w:szCs w:val="20"/>
-          <w:u w:val="none"/>
-          <w:shd w:fill="auto" w:val="clear"/>
-          <w:vertAlign w:val="baseline"/>
+          <w:sz w:val="20"/>
+          <w:szCs w:val="20"/>
+        </w:rPr>
+      </w:pPr>
+      <w:r>
+        <w:rPr>
+          <w:sz w:val="20"/>
+          <w:szCs w:val="20"/>
           <w:rtl w:val="0"/>
         </w:rPr>
         <w:t xml:space="preserve">React</w:t>
@@ -2533,96 +2466,32 @@
           <w:szCs w:val="20"/>
           <w:rtl w:val="0"/>
         </w:rPr>
-        <w:t xml:space="preserve">:</w:t>
-      </w:r>
-      <w:r>
-        <w:rPr>
-          <w:i w:val="0"/>
-          <w:iCs w:val="0"/>
-          <w:smallCaps w:val="0"/>
-          <w:strike w:val="0"/>
-          <w:sz w:val="20"/>
-          <w:szCs w:val="20"/>
-          <w:u w:val="none"/>
-          <w:shd w:fill="auto" w:val="clear"/>
-          <w:vertAlign w:val="baseline"/>
-          <w:rtl w:val="0"/>
-        </w:rPr>
-        <w:t xml:space="preserve"> </w:t>
-      </w:r>
-      <w:r>
-        <w:rPr>
-          <w:sz w:val="20"/>
-          <w:szCs w:val="20"/>
-          <w:rtl w:val="0"/>
-        </w:rPr>
-        <w:t xml:space="preserve">7</w:t>
-      </w:r>
-      <w:r>
-        <w:rPr>
-          <w:i w:val="0"/>
-          <w:iCs w:val="0"/>
-          <w:smallCaps w:val="0"/>
-          <w:strike w:val="0"/>
-          <w:sz w:val="20"/>
-          <w:szCs w:val="20"/>
-          <w:u w:val="none"/>
-          <w:shd w:fill="auto" w:val="clear"/>
-          <w:vertAlign w:val="baseline"/>
-          <w:rtl w:val="0"/>
-        </w:rPr>
-        <w:t xml:space="preserve"> years</w:t>
-      </w:r>
-      <w:r>
-        <w:rPr>
-          <w:rtl w:val="0"/>
-        </w:rPr>
-      </w:r>
-    </w:p>
-    <w:p>
-      <w:pPr>
-        <w:keepNext w:val="0"/>
-        <w:keepLines w:val="0"/>
-        <w:pageBreakBefore w:val="0"/>
-        <w:widowControl w:val="1"/>
+        <w:t xml:space="preserve"> – 7 years</w:t>
+      </w:r>
+      <w:r>
+        <w:rPr>
+          <w:rtl w:val="0"/>
+        </w:rPr>
+      </w:r>
+    </w:p>
+    <w:p>
+      <w:pPr>
         <w:numPr>
           <w:ilvl w:val="0"/>
           <w:numId w:val="1"/>
         </w:numPr>
-        <w:pBdr>
-          <w:top w:space="0" w:sz="0" w:val="nil"/>
-          <w:left w:space="0" w:sz="0" w:val="nil"/>
-          <w:bottom w:space="0" w:sz="0" w:val="nil"/>
-          <w:right w:space="0" w:sz="0" w:val="nil"/>
-          <w:between w:space="0" w:sz="0" w:val="nil"/>
-        </w:pBdr>
-        <w:shd w:fill="auto" w:val="clear"/>
-        <w:spacing w:after="0" w:before="0" w:line="276" w:lineRule="auto"/>
-        <w:ind w:left="720" w:right="0" w:hanging="360"/>
-        <w:jc w:val="left"/>
+        <w:spacing w:after="0" w:line="240" w:lineRule="auto"/>
+        <w:ind w:left="720" w:hanging="360"/>
         <w:rPr>
           <w:rFonts w:ascii="Calibri" w:cs="Calibri" w:eastAsia="Calibri" w:hAnsi="Calibri"/>
-          <w:i w:val="0"/>
-          <w:iCs w:val="0"/>
-          <w:smallCaps w:val="0"/>
-          <w:strike w:val="0"/>
-          <w:sz w:val="20"/>
-          <w:szCs w:val="20"/>
-          <w:shd w:fill="auto" w:val="clear"/>
-          <w:vertAlign w:val="baseline"/>
-        </w:rPr>
-      </w:pPr>
-      <w:r>
-        <w:rPr>
-          <w:i w:val="0"/>
-          <w:iCs w:val="0"/>
-          <w:smallCaps w:val="0"/>
-          <w:strike w:val="0"/>
-          <w:sz w:val="20"/>
-          <w:szCs w:val="20"/>
-          <w:u w:val="none"/>
-          <w:shd w:fill="auto" w:val="clear"/>
-          <w:vertAlign w:val="baseline"/>
+          <w:sz w:val="20"/>
+          <w:szCs w:val="20"/>
+        </w:rPr>
+      </w:pPr>
+      <w:r>
+        <w:rPr>
+          <w:sz w:val="20"/>
+          <w:szCs w:val="20"/>
           <w:rtl w:val="0"/>
         </w:rPr>
         <w:t xml:space="preserve">Next.js</w:t>
@@ -2633,96 +2502,32 @@
           <w:szCs w:val="20"/>
           <w:rtl w:val="0"/>
         </w:rPr>
-        <w:t xml:space="preserve">:</w:t>
-      </w:r>
-      <w:r>
-        <w:rPr>
-          <w:i w:val="0"/>
-          <w:iCs w:val="0"/>
-          <w:smallCaps w:val="0"/>
-          <w:strike w:val="0"/>
-          <w:sz w:val="20"/>
-          <w:szCs w:val="20"/>
-          <w:u w:val="none"/>
-          <w:shd w:fill="auto" w:val="clear"/>
-          <w:vertAlign w:val="baseline"/>
-          <w:rtl w:val="0"/>
-        </w:rPr>
-        <w:t xml:space="preserve"> </w:t>
-      </w:r>
-      <w:r>
-        <w:rPr>
-          <w:sz w:val="20"/>
-          <w:szCs w:val="20"/>
-          <w:rtl w:val="0"/>
-        </w:rPr>
-        <w:t xml:space="preserve">3</w:t>
-      </w:r>
-      <w:r>
-        <w:rPr>
-          <w:i w:val="0"/>
-          <w:iCs w:val="0"/>
-          <w:smallCaps w:val="0"/>
-          <w:strike w:val="0"/>
-          <w:sz w:val="20"/>
-          <w:szCs w:val="20"/>
-          <w:u w:val="none"/>
-          <w:shd w:fill="auto" w:val="clear"/>
-          <w:vertAlign w:val="baseline"/>
-          <w:rtl w:val="0"/>
-        </w:rPr>
-        <w:t xml:space="preserve"> years</w:t>
-      </w:r>
-      <w:r>
-        <w:rPr>
-          <w:rtl w:val="0"/>
-        </w:rPr>
-      </w:r>
-    </w:p>
-    <w:p>
-      <w:pPr>
-        <w:keepNext w:val="0"/>
-        <w:keepLines w:val="0"/>
-        <w:pageBreakBefore w:val="0"/>
-        <w:widowControl w:val="1"/>
+        <w:t xml:space="preserve"> – 3 years</w:t>
+      </w:r>
+      <w:r>
+        <w:rPr>
+          <w:rtl w:val="0"/>
+        </w:rPr>
+      </w:r>
+    </w:p>
+    <w:p>
+      <w:pPr>
         <w:numPr>
           <w:ilvl w:val="0"/>
           <w:numId w:val="1"/>
         </w:numPr>
-        <w:pBdr>
-          <w:top w:space="0" w:sz="0" w:val="nil"/>
-          <w:left w:space="0" w:sz="0" w:val="nil"/>
-          <w:bottom w:space="0" w:sz="0" w:val="nil"/>
-          <w:right w:space="0" w:sz="0" w:val="nil"/>
-          <w:between w:space="0" w:sz="0" w:val="nil"/>
-        </w:pBdr>
-        <w:shd w:fill="auto" w:val="clear"/>
-        <w:spacing w:after="0" w:before="0" w:line="276" w:lineRule="auto"/>
-        <w:ind w:left="720" w:right="0" w:hanging="360"/>
-        <w:jc w:val="left"/>
+        <w:spacing w:after="0" w:line="240" w:lineRule="auto"/>
+        <w:ind w:left="720" w:hanging="360"/>
         <w:rPr>
           <w:rFonts w:ascii="Calibri" w:cs="Calibri" w:eastAsia="Calibri" w:hAnsi="Calibri"/>
-          <w:i w:val="0"/>
-          <w:iCs w:val="0"/>
-          <w:smallCaps w:val="0"/>
-          <w:strike w:val="0"/>
-          <w:sz w:val="20"/>
-          <w:szCs w:val="20"/>
-          <w:shd w:fill="auto" w:val="clear"/>
-          <w:vertAlign w:val="baseline"/>
-        </w:rPr>
-      </w:pPr>
-      <w:r>
-        <w:rPr>
-          <w:i w:val="0"/>
-          <w:iCs w:val="0"/>
-          <w:smallCaps w:val="0"/>
-          <w:strike w:val="0"/>
-          <w:sz w:val="20"/>
-          <w:szCs w:val="20"/>
-          <w:u w:val="none"/>
-          <w:shd w:fill="auto" w:val="clear"/>
-          <w:vertAlign w:val="baseline"/>
+          <w:sz w:val="20"/>
+          <w:szCs w:val="20"/>
+        </w:rPr>
+      </w:pPr>
+      <w:r>
+        <w:rPr>
+          <w:sz w:val="20"/>
+          <w:szCs w:val="20"/>
           <w:rtl w:val="0"/>
         </w:rPr>
         <w:t xml:space="preserve">Redux</w:t>
@@ -2733,292 +2538,449 @@
           <w:szCs w:val="20"/>
           <w:rtl w:val="0"/>
         </w:rPr>
-        <w:t xml:space="preserve">:</w:t>
-      </w:r>
-      <w:r>
-        <w:rPr>
-          <w:i w:val="0"/>
-          <w:iCs w:val="0"/>
-          <w:smallCaps w:val="0"/>
-          <w:strike w:val="0"/>
-          <w:sz w:val="20"/>
-          <w:szCs w:val="20"/>
-          <w:u w:val="none"/>
-          <w:shd w:fill="auto" w:val="clear"/>
-          <w:vertAlign w:val="baseline"/>
-          <w:rtl w:val="0"/>
-        </w:rPr>
-        <w:t xml:space="preserve"> 3 years</w:t>
-      </w:r>
-      <w:r>
-        <w:rPr>
-          <w:rtl w:val="0"/>
-        </w:rPr>
-      </w:r>
-    </w:p>
-    <w:p>
-      <w:pPr>
-        <w:keepNext w:val="0"/>
-        <w:keepLines w:val="0"/>
-        <w:pageBreakBefore w:val="0"/>
-        <w:widowControl w:val="1"/>
+        <w:t xml:space="preserve"> – 3 years</w:t>
+      </w:r>
+    </w:p>
+    <w:p>
+      <w:pPr>
         <w:numPr>
           <w:ilvl w:val="0"/>
           <w:numId w:val="1"/>
         </w:numPr>
-        <w:pBdr>
-          <w:top w:space="0" w:sz="0" w:val="nil"/>
-          <w:left w:space="0" w:sz="0" w:val="nil"/>
-          <w:bottom w:space="0" w:sz="0" w:val="nil"/>
-          <w:right w:space="0" w:sz="0" w:val="nil"/>
-          <w:between w:space="0" w:sz="0" w:val="nil"/>
-        </w:pBdr>
-        <w:shd w:fill="auto" w:val="clear"/>
-        <w:spacing w:after="0" w:before="0" w:line="276" w:lineRule="auto"/>
-        <w:ind w:left="720" w:right="0" w:hanging="360"/>
-        <w:jc w:val="left"/>
+        <w:spacing w:after="0" w:line="240" w:lineRule="auto"/>
+        <w:ind w:left="720" w:hanging="360"/>
         <w:rPr>
           <w:rFonts w:ascii="Calibri" w:cs="Calibri" w:eastAsia="Calibri" w:hAnsi="Calibri"/>
-          <w:i w:val="0"/>
-          <w:iCs w:val="0"/>
-          <w:smallCaps w:val="0"/>
-          <w:strike w:val="0"/>
-          <w:sz w:val="20"/>
-          <w:szCs w:val="20"/>
-          <w:shd w:fill="auto" w:val="clear"/>
-          <w:vertAlign w:val="baseline"/>
-        </w:rPr>
-      </w:pPr>
-      <w:r>
-        <w:rPr>
-          <w:i w:val="0"/>
-          <w:iCs w:val="0"/>
-          <w:smallCaps w:val="0"/>
-          <w:strike w:val="0"/>
-          <w:sz w:val="20"/>
-          <w:szCs w:val="20"/>
-          <w:u w:val="none"/>
-          <w:shd w:fill="auto" w:val="clear"/>
-          <w:vertAlign w:val="baseline"/>
-          <w:rtl w:val="0"/>
-        </w:rPr>
-        <w:t xml:space="preserve">Tailwind CSS, Styled Components, Emotion</w:t>
-      </w:r>
-      <w:r>
-        <w:rPr>
-          <w:rtl w:val="0"/>
-        </w:rPr>
-      </w:r>
-    </w:p>
-    <w:p>
-      <w:pPr>
-        <w:keepNext w:val="0"/>
-        <w:keepLines w:val="0"/>
-        <w:pageBreakBefore w:val="0"/>
-        <w:widowControl w:val="1"/>
+          <w:sz w:val="20"/>
+          <w:szCs w:val="20"/>
+        </w:rPr>
+      </w:pPr>
+      <w:r>
+        <w:rPr>
+          <w:sz w:val="20"/>
+          <w:szCs w:val="20"/>
+          <w:rtl w:val="0"/>
+        </w:rPr>
+        <w:t xml:space="preserve">Testing</w:t>
+      </w:r>
+      <w:r>
+        <w:rPr>
+          <w:sz w:val="20"/>
+          <w:szCs w:val="20"/>
+          <w:rtl w:val="0"/>
+        </w:rPr>
+        <w:t xml:space="preserve"> – 5 years</w:t>
+      </w:r>
+    </w:p>
+    <w:p>
+      <w:pPr>
         <w:numPr>
           <w:ilvl w:val="0"/>
           <w:numId w:val="1"/>
         </w:numPr>
-        <w:pBdr>
-          <w:top w:space="0" w:sz="0" w:val="nil"/>
-          <w:left w:space="0" w:sz="0" w:val="nil"/>
-          <w:bottom w:space="0" w:sz="0" w:val="nil"/>
-          <w:right w:space="0" w:sz="0" w:val="nil"/>
-          <w:between w:space="0" w:sz="0" w:val="nil"/>
-        </w:pBdr>
-        <w:shd w:fill="auto" w:val="clear"/>
-        <w:spacing w:after="0" w:before="0" w:line="276" w:lineRule="auto"/>
-        <w:ind w:left="720" w:right="0" w:hanging="360"/>
-        <w:jc w:val="left"/>
+        <w:spacing w:after="0" w:line="240" w:lineRule="auto"/>
+        <w:ind w:left="720" w:hanging="360"/>
         <w:rPr>
           <w:rFonts w:ascii="Calibri" w:cs="Calibri" w:eastAsia="Calibri" w:hAnsi="Calibri"/>
-          <w:i w:val="0"/>
-          <w:iCs w:val="0"/>
-          <w:smallCaps w:val="0"/>
-          <w:strike w:val="0"/>
-          <w:sz w:val="20"/>
-          <w:szCs w:val="20"/>
-          <w:shd w:fill="auto" w:val="clear"/>
-          <w:vertAlign w:val="baseline"/>
-        </w:rPr>
-      </w:pPr>
-      <w:r>
-        <w:rPr>
-          <w:i w:val="0"/>
-          <w:iCs w:val="0"/>
-          <w:smallCaps w:val="0"/>
-          <w:strike w:val="0"/>
-          <w:sz w:val="20"/>
-          <w:szCs w:val="20"/>
-          <w:u w:val="none"/>
-          <w:shd w:fill="auto" w:val="clear"/>
-          <w:vertAlign w:val="baseline"/>
-          <w:rtl w:val="0"/>
-        </w:rPr>
-        <w:t xml:space="preserve">Bootstrap, Chakra UI, Material UI, shadcnui</w:t>
-      </w:r>
-      <w:r>
-        <w:rPr>
-          <w:rtl w:val="0"/>
-        </w:rPr>
-      </w:r>
-    </w:p>
-    <w:p>
-      <w:pPr>
-        <w:keepNext w:val="0"/>
-        <w:keepLines w:val="0"/>
-        <w:pageBreakBefore w:val="0"/>
-        <w:widowControl w:val="1"/>
+          <w:sz w:val="20"/>
+          <w:szCs w:val="20"/>
+        </w:rPr>
+      </w:pPr>
+      <w:r>
+        <w:rPr>
+          <w:sz w:val="20"/>
+          <w:szCs w:val="20"/>
+          <w:rtl w:val="0"/>
+        </w:rPr>
+        <w:t xml:space="preserve">Team Leader</w:t>
+      </w:r>
+      <w:r>
+        <w:rPr>
+          <w:sz w:val="20"/>
+          <w:szCs w:val="20"/>
+          <w:rtl w:val="0"/>
+        </w:rPr>
+        <w:t xml:space="preserve"> – 2 years</w:t>
+      </w:r>
+    </w:p>
+    <w:p>
+      <w:pPr>
         <w:numPr>
           <w:ilvl w:val="0"/>
           <w:numId w:val="1"/>
         </w:numPr>
-        <w:pBdr>
-          <w:top w:space="0" w:sz="0" w:val="nil"/>
-          <w:left w:space="0" w:sz="0" w:val="nil"/>
-          <w:bottom w:space="0" w:sz="0" w:val="nil"/>
-          <w:right w:space="0" w:sz="0" w:val="nil"/>
-          <w:between w:space="0" w:sz="0" w:val="nil"/>
-        </w:pBdr>
-        <w:shd w:fill="auto" w:val="clear"/>
-        <w:spacing w:after="0" w:before="0" w:line="276" w:lineRule="auto"/>
-        <w:ind w:left="720" w:right="0" w:hanging="360"/>
-        <w:jc w:val="left"/>
+        <w:spacing w:after="0" w:line="240" w:lineRule="auto"/>
+        <w:ind w:left="720" w:hanging="360"/>
         <w:rPr>
           <w:rFonts w:ascii="Calibri" w:cs="Calibri" w:eastAsia="Calibri" w:hAnsi="Calibri"/>
-          <w:i w:val="0"/>
-          <w:iCs w:val="0"/>
-          <w:smallCaps w:val="0"/>
-          <w:strike w:val="0"/>
-          <w:sz w:val="20"/>
-          <w:szCs w:val="20"/>
-          <w:shd w:fill="auto" w:val="clear"/>
-          <w:vertAlign w:val="baseline"/>
-        </w:rPr>
-      </w:pPr>
-      <w:r>
-        <w:rPr>
-          <w:i w:val="0"/>
-          <w:iCs w:val="0"/>
-          <w:smallCaps w:val="0"/>
-          <w:strike w:val="0"/>
-          <w:sz w:val="20"/>
-          <w:szCs w:val="20"/>
-          <w:u w:val="none"/>
-          <w:shd w:fill="auto" w:val="clear"/>
-          <w:vertAlign w:val="baseline"/>
-          <w:rtl w:val="0"/>
-        </w:rPr>
-        <w:t xml:space="preserve">Adobe XD, Figma, Storybook</w:t>
-      </w:r>
-      <w:r>
-        <w:rPr>
-          <w:rtl w:val="0"/>
-        </w:rPr>
-      </w:r>
-    </w:p>
-    <w:p>
-      <w:pPr>
-        <w:keepNext w:val="0"/>
-        <w:keepLines w:val="0"/>
-        <w:pageBreakBefore w:val="0"/>
-        <w:widowControl w:val="1"/>
+          <w:b w:val="1"/>
+          <w:bCs w:val="1"/>
+          <w:sz w:val="20"/>
+          <w:szCs w:val="20"/>
+          <w:highlight w:val="white"/>
+        </w:rPr>
+      </w:pPr>
+      <w:r>
+        <w:rPr>
+          <w:sz w:val="20"/>
+          <w:szCs w:val="20"/>
+          <w:highlight w:val="white"/>
+          <w:rtl w:val="0"/>
+        </w:rPr>
+        <w:t xml:space="preserve">Tailwind CSS</w:t>
+      </w:r>
+      <w:r>
+        <w:rPr>
+          <w:sz w:val="20"/>
+          <w:szCs w:val="20"/>
+          <w:highlight w:val="white"/>
+          <w:rtl w:val="0"/>
+        </w:rPr>
+        <w:t xml:space="preserve">, </w:t>
+      </w:r>
+      <w:r>
+        <w:rPr>
+          <w:sz w:val="20"/>
+          <w:szCs w:val="20"/>
+          <w:highlight w:val="white"/>
+          <w:rtl w:val="0"/>
+        </w:rPr>
+        <w:t xml:space="preserve">Styled Components</w:t>
+      </w:r>
+    </w:p>
+    <w:p>
+      <w:pPr>
         <w:numPr>
           <w:ilvl w:val="0"/>
           <w:numId w:val="1"/>
         </w:numPr>
-        <w:pBdr>
-          <w:top w:space="0" w:sz="0" w:val="nil"/>
-          <w:left w:space="0" w:sz="0" w:val="nil"/>
-          <w:bottom w:space="0" w:sz="0" w:val="nil"/>
-          <w:right w:space="0" w:sz="0" w:val="nil"/>
-          <w:between w:space="0" w:sz="0" w:val="nil"/>
-        </w:pBdr>
-        <w:shd w:fill="auto" w:val="clear"/>
-        <w:spacing w:after="0" w:before="0" w:line="276" w:lineRule="auto"/>
-        <w:ind w:left="720" w:right="0" w:hanging="360"/>
-        <w:jc w:val="left"/>
+        <w:spacing w:after="0" w:line="240" w:lineRule="auto"/>
+        <w:ind w:left="720" w:hanging="360"/>
         <w:rPr>
           <w:rFonts w:ascii="Calibri" w:cs="Calibri" w:eastAsia="Calibri" w:hAnsi="Calibri"/>
-          <w:i w:val="0"/>
-          <w:iCs w:val="0"/>
-          <w:smallCaps w:val="0"/>
-          <w:strike w:val="0"/>
-          <w:sz w:val="20"/>
-          <w:szCs w:val="20"/>
-          <w:shd w:fill="auto" w:val="clear"/>
-          <w:vertAlign w:val="baseline"/>
-        </w:rPr>
-      </w:pPr>
-      <w:r>
-        <w:rPr>
-          <w:i w:val="0"/>
-          <w:iCs w:val="0"/>
-          <w:smallCaps w:val="0"/>
-          <w:strike w:val="0"/>
-          <w:sz w:val="20"/>
-          <w:szCs w:val="20"/>
-          <w:u w:val="none"/>
-          <w:shd w:fill="auto" w:val="clear"/>
-          <w:vertAlign w:val="baseline"/>
-          <w:rtl w:val="0"/>
-        </w:rPr>
-        <w:t xml:space="preserve">CI/CD, GitHub Actions, Vercel, Netlify</w:t>
-      </w:r>
-      <w:r>
-        <w:rPr>
-          <w:rtl w:val="0"/>
-        </w:rPr>
-      </w:r>
-    </w:p>
-    <w:p>
-      <w:pPr>
-        <w:keepNext w:val="0"/>
-        <w:keepLines w:val="0"/>
-        <w:pageBreakBefore w:val="0"/>
-        <w:widowControl w:val="1"/>
+          <w:sz w:val="20"/>
+          <w:szCs w:val="20"/>
+          <w:highlight w:val="white"/>
+        </w:rPr>
+      </w:pPr>
+      <w:r>
+        <w:rPr>
+          <w:sz w:val="20"/>
+          <w:szCs w:val="20"/>
+          <w:highlight w:val="white"/>
+          <w:rtl w:val="0"/>
+        </w:rPr>
+        <w:t xml:space="preserve">Bootstrap</w:t>
+      </w:r>
+      <w:r>
+        <w:rPr>
+          <w:sz w:val="20"/>
+          <w:szCs w:val="20"/>
+          <w:highlight w:val="white"/>
+          <w:rtl w:val="0"/>
+        </w:rPr>
+        <w:t xml:space="preserve">, </w:t>
+      </w:r>
+      <w:r>
+        <w:rPr>
+          <w:sz w:val="20"/>
+          <w:szCs w:val="20"/>
+          <w:highlight w:val="white"/>
+          <w:rtl w:val="0"/>
+        </w:rPr>
+        <w:t xml:space="preserve">Chakra UI</w:t>
+      </w:r>
+      <w:r>
+        <w:rPr>
+          <w:sz w:val="20"/>
+          <w:szCs w:val="20"/>
+          <w:highlight w:val="white"/>
+          <w:rtl w:val="0"/>
+        </w:rPr>
+        <w:t xml:space="preserve">,</w:t>
+      </w:r>
+      <w:r>
+        <w:rPr>
+          <w:sz w:val="20"/>
+          <w:szCs w:val="20"/>
+          <w:highlight w:val="white"/>
+          <w:rtl w:val="0"/>
+        </w:rPr>
+        <w:t xml:space="preserve"> Material UI</w:t>
+      </w:r>
+      <w:r>
+        <w:rPr>
+          <w:sz w:val="20"/>
+          <w:szCs w:val="20"/>
+          <w:highlight w:val="white"/>
+          <w:rtl w:val="0"/>
+        </w:rPr>
+        <w:t xml:space="preserve">,</w:t>
+      </w:r>
+      <w:r>
+        <w:rPr>
+          <w:sz w:val="20"/>
+          <w:szCs w:val="20"/>
+          <w:highlight w:val="white"/>
+          <w:rtl w:val="0"/>
+        </w:rPr>
+        <w:t xml:space="preserve"> shadcnui</w:t>
+      </w:r>
+    </w:p>
+    <w:p>
+      <w:pPr>
         <w:numPr>
           <w:ilvl w:val="0"/>
           <w:numId w:val="1"/>
         </w:numPr>
-        <w:pBdr>
-          <w:top w:space="0" w:sz="0" w:val="nil"/>
-          <w:left w:space="0" w:sz="0" w:val="nil"/>
-          <w:bottom w:space="0" w:sz="0" w:val="nil"/>
-          <w:right w:space="0" w:sz="0" w:val="nil"/>
-          <w:between w:space="0" w:sz="0" w:val="nil"/>
-        </w:pBdr>
-        <w:shd w:fill="auto" w:val="clear"/>
-        <w:spacing w:after="0" w:before="0" w:line="276" w:lineRule="auto"/>
-        <w:ind w:left="720" w:right="0" w:hanging="360"/>
-        <w:jc w:val="left"/>
+        <w:spacing w:after="0" w:line="240" w:lineRule="auto"/>
+        <w:ind w:left="720" w:hanging="360"/>
         <w:rPr>
           <w:rFonts w:ascii="Calibri" w:cs="Calibri" w:eastAsia="Calibri" w:hAnsi="Calibri"/>
-          <w:i w:val="0"/>
-          <w:iCs w:val="0"/>
-          <w:smallCaps w:val="0"/>
-          <w:strike w:val="0"/>
-          <w:sz w:val="20"/>
-          <w:szCs w:val="20"/>
-          <w:shd w:fill="auto" w:val="clear"/>
-          <w:vertAlign w:val="baseline"/>
-        </w:rPr>
-      </w:pPr>
-      <w:r>
-        <w:rPr>
-          <w:i w:val="0"/>
-          <w:iCs w:val="0"/>
-          <w:smallCaps w:val="0"/>
-          <w:strike w:val="0"/>
-          <w:sz w:val="20"/>
-          <w:szCs w:val="20"/>
-          <w:u w:val="none"/>
-          <w:shd w:fill="auto" w:val="clear"/>
-          <w:vertAlign w:val="baseline"/>
-          <w:rtl w:val="0"/>
-        </w:rPr>
-        <w:t xml:space="preserve">Cypress, Playwright, Jest</w:t>
+          <w:sz w:val="20"/>
+          <w:szCs w:val="20"/>
+          <w:highlight w:val="white"/>
+        </w:rPr>
+      </w:pPr>
+      <w:r>
+        <w:rPr>
+          <w:sz w:val="20"/>
+          <w:szCs w:val="20"/>
+          <w:highlight w:val="white"/>
+          <w:rtl w:val="0"/>
+        </w:rPr>
+        <w:t xml:space="preserve">REST API, GraphQL</w:t>
+      </w:r>
+    </w:p>
+    <w:p>
+      <w:pPr>
+        <w:numPr>
+          <w:ilvl w:val="0"/>
+          <w:numId w:val="1"/>
+        </w:numPr>
+        <w:spacing w:after="0" w:line="240" w:lineRule="auto"/>
+        <w:ind w:left="720" w:hanging="360"/>
+        <w:rPr>
+          <w:rFonts w:ascii="Calibri" w:cs="Calibri" w:eastAsia="Calibri" w:hAnsi="Calibri"/>
+          <w:sz w:val="20"/>
+          <w:szCs w:val="20"/>
+          <w:highlight w:val="white"/>
+        </w:rPr>
+      </w:pPr>
+      <w:r>
+        <w:rPr>
+          <w:sz w:val="20"/>
+          <w:szCs w:val="20"/>
+          <w:highlight w:val="white"/>
+          <w:rtl w:val="0"/>
+        </w:rPr>
+        <w:t xml:space="preserve">React Hook Form, ZOD, Redux, Zustand</w:t>
+      </w:r>
+    </w:p>
+    <w:p>
+      <w:pPr>
+        <w:numPr>
+          <w:ilvl w:val="0"/>
+          <w:numId w:val="1"/>
+        </w:numPr>
+        <w:spacing w:after="0" w:line="240" w:lineRule="auto"/>
+        <w:ind w:left="720" w:hanging="360"/>
+        <w:rPr>
+          <w:rFonts w:ascii="Calibri" w:cs="Calibri" w:eastAsia="Calibri" w:hAnsi="Calibri"/>
+          <w:sz w:val="20"/>
+          <w:szCs w:val="20"/>
+          <w:highlight w:val="white"/>
+        </w:rPr>
+      </w:pPr>
+      <w:r>
+        <w:rPr>
+          <w:sz w:val="20"/>
+          <w:szCs w:val="20"/>
+          <w:highlight w:val="white"/>
+          <w:rtl w:val="0"/>
+        </w:rPr>
+        <w:t xml:space="preserve">CI/CD</w:t>
+      </w:r>
+      <w:r>
+        <w:rPr>
+          <w:sz w:val="20"/>
+          <w:szCs w:val="20"/>
+          <w:highlight w:val="white"/>
+          <w:rtl w:val="0"/>
+        </w:rPr>
+        <w:t xml:space="preserve">,</w:t>
+      </w:r>
+      <w:r>
+        <w:rPr>
+          <w:sz w:val="20"/>
+          <w:szCs w:val="20"/>
+          <w:highlight w:val="white"/>
+          <w:rtl w:val="0"/>
+        </w:rPr>
+        <w:t xml:space="preserve"> GitHub Actions</w:t>
+      </w:r>
+      <w:r>
+        <w:rPr>
+          <w:sz w:val="20"/>
+          <w:szCs w:val="20"/>
+          <w:highlight w:val="white"/>
+          <w:rtl w:val="0"/>
+        </w:rPr>
+        <w:t xml:space="preserve">, </w:t>
+      </w:r>
+      <w:r>
+        <w:rPr>
+          <w:sz w:val="20"/>
+          <w:szCs w:val="20"/>
+          <w:highlight w:val="white"/>
+          <w:rtl w:val="0"/>
+        </w:rPr>
+        <w:t xml:space="preserve">Vercel</w:t>
+      </w:r>
+      <w:r>
+        <w:rPr>
+          <w:sz w:val="20"/>
+          <w:szCs w:val="20"/>
+          <w:highlight w:val="white"/>
+          <w:rtl w:val="0"/>
+        </w:rPr>
+        <w:t xml:space="preserve">, </w:t>
+      </w:r>
+      <w:r>
+        <w:rPr>
+          <w:sz w:val="20"/>
+          <w:szCs w:val="20"/>
+          <w:highlight w:val="white"/>
+          <w:rtl w:val="0"/>
+        </w:rPr>
+        <w:t xml:space="preserve">Netlify</w:t>
+      </w:r>
+      <w:r>
+        <w:rPr>
+          <w:rtl w:val="0"/>
+        </w:rPr>
+      </w:r>
+    </w:p>
+    <w:p>
+      <w:pPr>
+        <w:numPr>
+          <w:ilvl w:val="0"/>
+          <w:numId w:val="1"/>
+        </w:numPr>
+        <w:spacing w:after="0" w:line="240" w:lineRule="auto"/>
+        <w:ind w:left="720" w:hanging="360"/>
+        <w:rPr>
+          <w:rFonts w:ascii="Calibri" w:cs="Calibri" w:eastAsia="Calibri" w:hAnsi="Calibri"/>
+          <w:sz w:val="20"/>
+          <w:szCs w:val="20"/>
+          <w:highlight w:val="white"/>
+        </w:rPr>
+      </w:pPr>
+      <w:r>
+        <w:rPr>
+          <w:sz w:val="20"/>
+          <w:szCs w:val="20"/>
+          <w:highlight w:val="white"/>
+          <w:rtl w:val="0"/>
+        </w:rPr>
+        <w:t xml:space="preserve">Cypress</w:t>
+      </w:r>
+      <w:r>
+        <w:rPr>
+          <w:sz w:val="20"/>
+          <w:szCs w:val="20"/>
+          <w:highlight w:val="white"/>
+          <w:rtl w:val="0"/>
+        </w:rPr>
+        <w:t xml:space="preserve">, </w:t>
+      </w:r>
+      <w:r>
+        <w:rPr>
+          <w:sz w:val="20"/>
+          <w:szCs w:val="20"/>
+          <w:highlight w:val="white"/>
+          <w:rtl w:val="0"/>
+        </w:rPr>
+        <w:t xml:space="preserve">Playwright</w:t>
+      </w:r>
+      <w:r>
+        <w:rPr>
+          <w:sz w:val="20"/>
+          <w:szCs w:val="20"/>
+          <w:highlight w:val="white"/>
+          <w:rtl w:val="0"/>
+        </w:rPr>
+        <w:t xml:space="preserve">, </w:t>
+      </w:r>
+      <w:r>
+        <w:rPr>
+          <w:sz w:val="20"/>
+          <w:szCs w:val="20"/>
+          <w:highlight w:val="white"/>
+          <w:rtl w:val="0"/>
+        </w:rPr>
+        <w:t xml:space="preserve">Jest</w:t>
+      </w:r>
+    </w:p>
+    <w:p>
+      <w:pPr>
+        <w:numPr>
+          <w:ilvl w:val="0"/>
+          <w:numId w:val="1"/>
+        </w:numPr>
+        <w:spacing w:after="0" w:line="240" w:lineRule="auto"/>
+        <w:ind w:left="720" w:hanging="360"/>
+        <w:rPr>
+          <w:rFonts w:ascii="Calibri" w:cs="Calibri" w:eastAsia="Calibri" w:hAnsi="Calibri"/>
+          <w:sz w:val="20"/>
+          <w:szCs w:val="20"/>
+          <w:highlight w:val="white"/>
+        </w:rPr>
+      </w:pPr>
+      <w:r>
+        <w:rPr>
+          <w:sz w:val="20"/>
+          <w:szCs w:val="20"/>
+          <w:highlight w:val="white"/>
+          <w:rtl w:val="0"/>
+        </w:rPr>
+        <w:t xml:space="preserve">Adobe XD</w:t>
+      </w:r>
+      <w:r>
+        <w:rPr>
+          <w:sz w:val="20"/>
+          <w:szCs w:val="20"/>
+          <w:highlight w:val="white"/>
+          <w:rtl w:val="0"/>
+        </w:rPr>
+        <w:t xml:space="preserve">, </w:t>
+      </w:r>
+      <w:r>
+        <w:rPr>
+          <w:sz w:val="20"/>
+          <w:szCs w:val="20"/>
+          <w:highlight w:val="white"/>
+          <w:rtl w:val="0"/>
+        </w:rPr>
+        <w:t xml:space="preserve">Figma</w:t>
+      </w:r>
+      <w:r>
+        <w:rPr>
+          <w:sz w:val="20"/>
+          <w:szCs w:val="20"/>
+          <w:highlight w:val="white"/>
+          <w:rtl w:val="0"/>
+        </w:rPr>
+        <w:t xml:space="preserve">,</w:t>
+      </w:r>
+      <w:r>
+        <w:rPr>
+          <w:sz w:val="20"/>
+          <w:szCs w:val="20"/>
+          <w:highlight w:val="white"/>
+          <w:rtl w:val="0"/>
+        </w:rPr>
+        <w:t xml:space="preserve"> Storybook</w:t>
       </w:r>
       <w:r>
         <w:rPr>
@@ -3304,47 +3266,16 @@
           <w:vertAlign w:val="baseline"/>
           <w:rtl w:val="0"/>
         </w:rPr>
-        <w:t xml:space="preserve">Czech: Native</w:t>
-      </w:r>
-      <w:r>
-        <w:rPr>
-          <w:rtl w:val="0"/>
-        </w:rPr>
-      </w:r>
-    </w:p>
-    <w:p>
-      <w:pPr>
-        <w:keepNext w:val="0"/>
-        <w:keepLines w:val="0"/>
-        <w:pageBreakBefore w:val="0"/>
-        <w:widowControl w:val="1"/>
-        <w:numPr>
-          <w:ilvl w:val="0"/>
-          <w:numId w:val="7"/>
-        </w:numPr>
-        <w:pBdr>
-          <w:top w:space="0" w:sz="0" w:val="nil"/>
-          <w:left w:space="0" w:sz="0" w:val="nil"/>
-          <w:bottom w:space="0" w:sz="0" w:val="nil"/>
-          <w:right w:space="0" w:sz="0" w:val="nil"/>
-          <w:between w:space="0" w:sz="0" w:val="nil"/>
-        </w:pBdr>
-        <w:shd w:fill="auto" w:val="clear"/>
-        <w:spacing w:after="200" w:before="0" w:line="276" w:lineRule="auto"/>
-        <w:ind w:left="720" w:right="0" w:hanging="360"/>
-        <w:jc w:val="left"/>
-        <w:rPr>
-          <w:rFonts w:ascii="Calibri" w:cs="Calibri" w:eastAsia="Calibri" w:hAnsi="Calibri"/>
-          <w:i w:val="0"/>
-          <w:iCs w:val="0"/>
-          <w:smallCaps w:val="0"/>
-          <w:strike w:val="0"/>
-          <w:sz w:val="20"/>
-          <w:szCs w:val="20"/>
-          <w:shd w:fill="auto" w:val="clear"/>
-          <w:vertAlign w:val="baseline"/>
-        </w:rPr>
-      </w:pPr>
+        <w:t xml:space="preserve">Czech </w:t>
+      </w:r>
+      <w:r>
+        <w:rPr>
+          <w:sz w:val="16"/>
+          <w:szCs w:val="16"/>
+          <w:rtl w:val="0"/>
+        </w:rPr>
+        <w:t xml:space="preserve">&amp;</w:t>
+      </w:r>
       <w:r>
         <w:rPr>
           <w:i w:val="0"/>
@@ -3358,7 +3289,7 @@
           <w:vertAlign w:val="baseline"/>
           <w:rtl w:val="0"/>
         </w:rPr>
-        <w:t xml:space="preserve">Slovak: Native</w:t>
+        <w:t xml:space="preserve"> Slovak: Native</w:t>
       </w:r>
       <w:r>
         <w:rPr>

</xml_diff>